<commit_message>
Actualizar BD01A_Examen.pdf, BD01B_Examen.pdf y 24 más archivos...
</commit_message>
<xml_diff>
--- a/BD03B_DiagramaER-2022/visus_garcia_victor_BD03_Tarea.docx
+++ b/BD03B_DiagramaER-2022/visus_garcia_victor_BD03_Tarea.docx
@@ -148,7 +148,7 @@
           <w:szCs w:val="28"/>
         </w:rPr>
         <w:tab/>
-        <w:t>………………………</w:t>
+        <w:t>……………………………………………………………………….</w:t>
       </w:r>
       <w:r>
         <w:rPr>
@@ -156,30 +156,7 @@
           <w:sz w:val="28"/>
           <w:szCs w:val="28"/>
         </w:rPr>
-        <w:t>……………………………………………</w:t>
-      </w:r>
-      <w:r>
-        <w:rPr>
-          <w:rFonts w:asciiTheme="majorHAnsi" w:hAnsiTheme="majorHAnsi" w:cstheme="majorHAnsi"/>
-          <w:sz w:val="28"/>
-          <w:szCs w:val="28"/>
-        </w:rPr>
-        <w:t>….</w:t>
-      </w:r>
-      <w:r>
-        <w:rPr>
-          <w:rFonts w:asciiTheme="majorHAnsi" w:hAnsiTheme="majorHAnsi" w:cstheme="majorHAnsi"/>
-          <w:sz w:val="28"/>
-          <w:szCs w:val="28"/>
-        </w:rPr>
         <w:tab/>
-      </w:r>
-      <w:r>
-        <w:rPr>
-          <w:rFonts w:asciiTheme="majorHAnsi" w:hAnsiTheme="majorHAnsi" w:cstheme="majorHAnsi"/>
-          <w:sz w:val="28"/>
-          <w:szCs w:val="28"/>
-        </w:rPr>
         <w:t>2</w:t>
       </w:r>
     </w:p>
@@ -251,7 +228,7 @@
           <w:szCs w:val="28"/>
         </w:rPr>
         <w:tab/>
-        <w:t>………………………</w:t>
+        <w:t>……………………………………….</w:t>
       </w:r>
       <w:r>
         <w:rPr>
@@ -259,30 +236,7 @@
           <w:sz w:val="28"/>
           <w:szCs w:val="28"/>
         </w:rPr>
-        <w:t>……………</w:t>
-      </w:r>
-      <w:r>
-        <w:rPr>
-          <w:rFonts w:asciiTheme="majorHAnsi" w:hAnsiTheme="majorHAnsi" w:cstheme="majorHAnsi"/>
-          <w:sz w:val="28"/>
-          <w:szCs w:val="28"/>
-        </w:rPr>
-        <w:t>….</w:t>
-      </w:r>
-      <w:r>
-        <w:rPr>
-          <w:rFonts w:asciiTheme="majorHAnsi" w:hAnsiTheme="majorHAnsi" w:cstheme="majorHAnsi"/>
-          <w:sz w:val="28"/>
-          <w:szCs w:val="28"/>
-        </w:rPr>
         <w:tab/>
-      </w:r>
-      <w:r>
-        <w:rPr>
-          <w:rFonts w:asciiTheme="majorHAnsi" w:hAnsiTheme="majorHAnsi" w:cstheme="majorHAnsi"/>
-          <w:sz w:val="28"/>
-          <w:szCs w:val="28"/>
-        </w:rPr>
         <w:t>7</w:t>
       </w:r>
     </w:p>
@@ -314,7 +268,7 @@
           <w:szCs w:val="28"/>
         </w:rPr>
         <w:tab/>
-        <w:t>………………………</w:t>
+        <w:t>……………………………………………………………………………….</w:t>
       </w:r>
       <w:r>
         <w:rPr>
@@ -322,30 +276,7 @@
           <w:sz w:val="28"/>
           <w:szCs w:val="28"/>
         </w:rPr>
-        <w:t>……………………………………………………</w:t>
-      </w:r>
-      <w:r>
-        <w:rPr>
-          <w:rFonts w:asciiTheme="majorHAnsi" w:hAnsiTheme="majorHAnsi" w:cstheme="majorHAnsi"/>
-          <w:sz w:val="28"/>
-          <w:szCs w:val="28"/>
-        </w:rPr>
-        <w:t>….</w:t>
-      </w:r>
-      <w:r>
-        <w:rPr>
-          <w:rFonts w:asciiTheme="majorHAnsi" w:hAnsiTheme="majorHAnsi" w:cstheme="majorHAnsi"/>
-          <w:sz w:val="28"/>
-          <w:szCs w:val="28"/>
-        </w:rPr>
         <w:tab/>
-      </w:r>
-      <w:r>
-        <w:rPr>
-          <w:rFonts w:asciiTheme="majorHAnsi" w:hAnsiTheme="majorHAnsi" w:cstheme="majorHAnsi"/>
-          <w:sz w:val="28"/>
-          <w:szCs w:val="28"/>
-        </w:rPr>
         <w:t>8</w:t>
       </w:r>
     </w:p>
@@ -377,23 +308,7 @@
           <w:szCs w:val="28"/>
         </w:rPr>
         <w:tab/>
-        <w:t>………………………</w:t>
-      </w:r>
-      <w:r>
-        <w:rPr>
-          <w:rFonts w:asciiTheme="majorHAnsi" w:hAnsiTheme="majorHAnsi" w:cstheme="majorHAnsi"/>
-          <w:sz w:val="28"/>
-          <w:szCs w:val="28"/>
-        </w:rPr>
-        <w:t>……………………………………………………</w:t>
-      </w:r>
-      <w:r>
-        <w:rPr>
-          <w:rFonts w:asciiTheme="majorHAnsi" w:hAnsiTheme="majorHAnsi" w:cstheme="majorHAnsi"/>
-          <w:sz w:val="28"/>
-          <w:szCs w:val="28"/>
-        </w:rPr>
-        <w:t>….</w:t>
+        <w:t>……………………………………………………………………………….</w:t>
       </w:r>
       <w:r>
         <w:rPr>
@@ -824,6 +739,7 @@
                 <w:szCs w:val="18"/>
               </w:rPr>
             </w:pPr>
+            <w:proofErr w:type="spellStart"/>
             <w:r>
               <w:rPr>
                 <w:rFonts w:asciiTheme="minorHAnsi" w:hAnsiTheme="minorHAnsi" w:cstheme="minorHAnsi"/>
@@ -832,6 +748,7 @@
               </w:rPr>
               <w:t>dni</w:t>
             </w:r>
+            <w:proofErr w:type="spellEnd"/>
           </w:p>
         </w:tc>
         <w:tc>
@@ -1372,6 +1289,7 @@
                 <w:szCs w:val="18"/>
               </w:rPr>
             </w:pPr>
+            <w:proofErr w:type="spellStart"/>
             <w:r>
               <w:rPr>
                 <w:rFonts w:asciiTheme="minorHAnsi" w:hAnsiTheme="minorHAnsi" w:cstheme="minorHAnsi"/>
@@ -1380,6 +1298,7 @@
               </w:rPr>
               <w:t>fecha_nacimiento</w:t>
             </w:r>
+            <w:proofErr w:type="spellEnd"/>
           </w:p>
         </w:tc>
         <w:tc>
@@ -1507,6 +1426,7 @@
                 <w:szCs w:val="18"/>
               </w:rPr>
             </w:pPr>
+            <w:proofErr w:type="spellStart"/>
             <w:r>
               <w:rPr>
                 <w:rFonts w:asciiTheme="minorHAnsi" w:hAnsiTheme="minorHAnsi" w:cstheme="minorHAnsi"/>
@@ -1515,6 +1435,7 @@
               </w:rPr>
               <w:t>direccion</w:t>
             </w:r>
+            <w:proofErr w:type="spellEnd"/>
           </w:p>
         </w:tc>
         <w:tc>
@@ -2482,6 +2403,7 @@
                 <w:szCs w:val="18"/>
               </w:rPr>
             </w:pPr>
+            <w:proofErr w:type="spellStart"/>
             <w:r>
               <w:rPr>
                 <w:rFonts w:asciiTheme="minorHAnsi" w:hAnsiTheme="minorHAnsi" w:cstheme="minorHAnsi"/>
@@ -2490,6 +2412,7 @@
               </w:rPr>
               <w:t>cod_centro</w:t>
             </w:r>
+            <w:proofErr w:type="spellEnd"/>
           </w:p>
         </w:tc>
         <w:tc>
@@ -2600,6 +2523,7 @@
                 <w:szCs w:val="18"/>
               </w:rPr>
             </w:pPr>
+            <w:proofErr w:type="spellStart"/>
             <w:r>
               <w:rPr>
                 <w:rFonts w:asciiTheme="minorHAnsi" w:hAnsiTheme="minorHAnsi" w:cstheme="minorHAnsi"/>
@@ -2608,6 +2532,7 @@
               </w:rPr>
               <w:t>Autoincremental</w:t>
             </w:r>
+            <w:proofErr w:type="spellEnd"/>
           </w:p>
         </w:tc>
       </w:tr>
@@ -2635,6 +2560,7 @@
                 <w:szCs w:val="18"/>
               </w:rPr>
             </w:pPr>
+            <w:proofErr w:type="spellStart"/>
             <w:r>
               <w:rPr>
                 <w:rFonts w:asciiTheme="minorHAnsi" w:hAnsiTheme="minorHAnsi" w:cstheme="minorHAnsi"/>
@@ -2643,6 +2569,7 @@
               </w:rPr>
               <w:t>nombre_centro</w:t>
             </w:r>
+            <w:proofErr w:type="spellEnd"/>
           </w:p>
         </w:tc>
         <w:tc>
@@ -2770,6 +2697,7 @@
                 <w:szCs w:val="18"/>
               </w:rPr>
             </w:pPr>
+            <w:proofErr w:type="spellStart"/>
             <w:r>
               <w:rPr>
                 <w:rFonts w:asciiTheme="minorHAnsi" w:hAnsiTheme="minorHAnsi" w:cstheme="minorHAnsi"/>
@@ -2778,6 +2706,7 @@
               </w:rPr>
               <w:t>municipio_centro</w:t>
             </w:r>
+            <w:proofErr w:type="spellEnd"/>
           </w:p>
         </w:tc>
         <w:tc>
@@ -2905,6 +2834,7 @@
                 <w:szCs w:val="18"/>
               </w:rPr>
             </w:pPr>
+            <w:proofErr w:type="spellStart"/>
             <w:r>
               <w:rPr>
                 <w:rFonts w:asciiTheme="minorHAnsi" w:hAnsiTheme="minorHAnsi" w:cstheme="minorHAnsi"/>
@@ -2913,6 +2843,7 @@
               </w:rPr>
               <w:t>provincia_centro</w:t>
             </w:r>
+            <w:proofErr w:type="spellEnd"/>
           </w:p>
         </w:tc>
         <w:tc>
@@ -3295,6 +3226,7 @@
                 <w:szCs w:val="18"/>
               </w:rPr>
             </w:pPr>
+            <w:proofErr w:type="spellStart"/>
             <w:r>
               <w:rPr>
                 <w:rFonts w:asciiTheme="minorHAnsi" w:hAnsiTheme="minorHAnsi" w:cstheme="minorHAnsi"/>
@@ -3303,6 +3235,7 @@
               </w:rPr>
               <w:t>cod_titulacion</w:t>
             </w:r>
+            <w:proofErr w:type="spellEnd"/>
           </w:p>
         </w:tc>
         <w:tc>
@@ -3413,6 +3346,7 @@
                 <w:szCs w:val="18"/>
               </w:rPr>
             </w:pPr>
+            <w:proofErr w:type="spellStart"/>
             <w:r>
               <w:rPr>
                 <w:rFonts w:asciiTheme="minorHAnsi" w:hAnsiTheme="minorHAnsi" w:cstheme="minorHAnsi"/>
@@ -3421,6 +3355,7 @@
               </w:rPr>
               <w:t>Autoincremental</w:t>
             </w:r>
+            <w:proofErr w:type="spellEnd"/>
           </w:p>
         </w:tc>
       </w:tr>
@@ -3448,6 +3383,7 @@
                 <w:szCs w:val="18"/>
               </w:rPr>
             </w:pPr>
+            <w:proofErr w:type="spellStart"/>
             <w:r>
               <w:rPr>
                 <w:rFonts w:asciiTheme="minorHAnsi" w:hAnsiTheme="minorHAnsi" w:cstheme="minorHAnsi"/>
@@ -3456,6 +3392,7 @@
               </w:rPr>
               <w:t>nombre_titulacion</w:t>
             </w:r>
+            <w:proofErr w:type="spellEnd"/>
           </w:p>
         </w:tc>
         <w:tc>
@@ -3855,6 +3792,7 @@
                 <w:szCs w:val="18"/>
               </w:rPr>
             </w:pPr>
+            <w:proofErr w:type="spellStart"/>
             <w:r>
               <w:rPr>
                 <w:rFonts w:asciiTheme="minorHAnsi" w:hAnsiTheme="minorHAnsi" w:cstheme="minorHAnsi"/>
@@ -3863,6 +3801,7 @@
               </w:rPr>
               <w:t>cod_proyecto</w:t>
             </w:r>
+            <w:proofErr w:type="spellEnd"/>
           </w:p>
         </w:tc>
         <w:tc>
@@ -3973,6 +3912,7 @@
                 <w:szCs w:val="18"/>
               </w:rPr>
             </w:pPr>
+            <w:proofErr w:type="spellStart"/>
             <w:r>
               <w:rPr>
                 <w:rFonts w:asciiTheme="minorHAnsi" w:hAnsiTheme="minorHAnsi" w:cstheme="minorHAnsi"/>
@@ -3981,6 +3921,7 @@
               </w:rPr>
               <w:t>Autoincremental</w:t>
             </w:r>
+            <w:proofErr w:type="spellEnd"/>
           </w:p>
         </w:tc>
       </w:tr>
@@ -4008,6 +3949,7 @@
                 <w:szCs w:val="18"/>
               </w:rPr>
             </w:pPr>
+            <w:proofErr w:type="spellStart"/>
             <w:r>
               <w:rPr>
                 <w:rFonts w:asciiTheme="minorHAnsi" w:hAnsiTheme="minorHAnsi" w:cstheme="minorHAnsi"/>
@@ -4016,6 +3958,7 @@
               </w:rPr>
               <w:t>titulo_proyecto</w:t>
             </w:r>
+            <w:proofErr w:type="spellEnd"/>
           </w:p>
         </w:tc>
         <w:tc>
@@ -4041,13 +3984,23 @@
                 <w:szCs w:val="18"/>
               </w:rPr>
             </w:pPr>
-            <w:r>
-              <w:rPr>
-                <w:rFonts w:asciiTheme="minorHAnsi" w:hAnsiTheme="minorHAnsi" w:cstheme="minorHAnsi"/>
-                <w:sz w:val="18"/>
-                <w:szCs w:val="18"/>
-              </w:rPr>
-              <w:t>Titulo que recibe el Proyecto</w:t>
+            <w:proofErr w:type="spellStart"/>
+            <w:r>
+              <w:rPr>
+                <w:rFonts w:asciiTheme="minorHAnsi" w:hAnsiTheme="minorHAnsi" w:cstheme="minorHAnsi"/>
+                <w:sz w:val="18"/>
+                <w:szCs w:val="18"/>
+              </w:rPr>
+              <w:t>Titulo</w:t>
+            </w:r>
+            <w:proofErr w:type="spellEnd"/>
+            <w:r>
+              <w:rPr>
+                <w:rFonts w:asciiTheme="minorHAnsi" w:hAnsiTheme="minorHAnsi" w:cstheme="minorHAnsi"/>
+                <w:sz w:val="18"/>
+                <w:szCs w:val="18"/>
+              </w:rPr>
+              <w:t xml:space="preserve"> que recibe el Proyecto</w:t>
             </w:r>
           </w:p>
         </w:tc>
@@ -4278,6 +4231,7 @@
                 <w:szCs w:val="18"/>
               </w:rPr>
             </w:pPr>
+            <w:proofErr w:type="spellStart"/>
             <w:r>
               <w:rPr>
                 <w:rFonts w:asciiTheme="minorHAnsi" w:hAnsiTheme="minorHAnsi" w:cstheme="minorHAnsi"/>
@@ -4286,6 +4240,7 @@
               </w:rPr>
               <w:t>fecha_entrega</w:t>
             </w:r>
+            <w:proofErr w:type="spellEnd"/>
           </w:p>
         </w:tc>
         <w:tc>
@@ -4796,6 +4751,7 @@
                 <w:szCs w:val="18"/>
               </w:rPr>
             </w:pPr>
+            <w:proofErr w:type="spellStart"/>
             <w:r>
               <w:rPr>
                 <w:rFonts w:asciiTheme="minorHAnsi" w:hAnsiTheme="minorHAnsi" w:cstheme="minorHAnsi"/>
@@ -4804,6 +4760,7 @@
               </w:rPr>
               <w:t>dni</w:t>
             </w:r>
+            <w:proofErr w:type="spellEnd"/>
           </w:p>
         </w:tc>
         <w:tc>
@@ -5859,6 +5816,7 @@
                 <w:szCs w:val="18"/>
               </w:rPr>
             </w:pPr>
+            <w:proofErr w:type="spellStart"/>
             <w:r>
               <w:rPr>
                 <w:rFonts w:asciiTheme="minorHAnsi" w:hAnsiTheme="minorHAnsi" w:cstheme="minorHAnsi"/>
@@ -5867,6 +5825,7 @@
               </w:rPr>
               <w:t>cif</w:t>
             </w:r>
+            <w:proofErr w:type="spellEnd"/>
           </w:p>
         </w:tc>
         <w:tc>
@@ -6129,6 +6088,7 @@
                 <w:szCs w:val="18"/>
               </w:rPr>
             </w:pPr>
+            <w:proofErr w:type="spellStart"/>
             <w:r>
               <w:rPr>
                 <w:rFonts w:asciiTheme="minorHAnsi" w:hAnsiTheme="minorHAnsi" w:cstheme="minorHAnsi"/>
@@ -6137,6 +6097,7 @@
               </w:rPr>
               <w:t>num_convenio</w:t>
             </w:r>
+            <w:proofErr w:type="spellEnd"/>
           </w:p>
         </w:tc>
         <w:tc>
@@ -6298,6 +6259,7 @@
                 <w:szCs w:val="18"/>
               </w:rPr>
             </w:pPr>
+            <w:proofErr w:type="spellStart"/>
             <w:r>
               <w:rPr>
                 <w:rFonts w:asciiTheme="minorHAnsi" w:hAnsiTheme="minorHAnsi" w:cstheme="minorHAnsi"/>
@@ -6306,6 +6268,7 @@
               </w:rPr>
               <w:t>direccion</w:t>
             </w:r>
+            <w:proofErr w:type="spellEnd"/>
           </w:p>
         </w:tc>
         <w:tc>
@@ -6568,6 +6531,7 @@
                 <w:szCs w:val="18"/>
               </w:rPr>
             </w:pPr>
+            <w:proofErr w:type="spellStart"/>
             <w:r>
               <w:rPr>
                 <w:rFonts w:asciiTheme="minorHAnsi" w:hAnsiTheme="minorHAnsi" w:cstheme="minorHAnsi"/>
@@ -6576,6 +6540,7 @@
               </w:rPr>
               <w:t>cod_postal</w:t>
             </w:r>
+            <w:proofErr w:type="spellEnd"/>
           </w:p>
         </w:tc>
         <w:tc>
@@ -7130,6 +7095,7 @@
                 <w:szCs w:val="18"/>
               </w:rPr>
             </w:pPr>
+            <w:proofErr w:type="spellStart"/>
             <w:r>
               <w:rPr>
                 <w:rFonts w:asciiTheme="minorHAnsi" w:hAnsiTheme="minorHAnsi" w:cstheme="minorHAnsi"/>
@@ -7138,6 +7104,7 @@
               </w:rPr>
               <w:t>cod_actividad</w:t>
             </w:r>
+            <w:proofErr w:type="spellEnd"/>
           </w:p>
         </w:tc>
         <w:tc>
@@ -7248,6 +7215,7 @@
                 <w:szCs w:val="18"/>
               </w:rPr>
             </w:pPr>
+            <w:proofErr w:type="spellStart"/>
             <w:r>
               <w:rPr>
                 <w:rFonts w:asciiTheme="minorHAnsi" w:hAnsiTheme="minorHAnsi" w:cstheme="minorHAnsi"/>
@@ -7256,6 +7224,7 @@
               </w:rPr>
               <w:t>Autoincremental</w:t>
             </w:r>
+            <w:proofErr w:type="spellEnd"/>
           </w:p>
         </w:tc>
       </w:tr>
@@ -7283,6 +7252,7 @@
                 <w:szCs w:val="18"/>
               </w:rPr>
             </w:pPr>
+            <w:proofErr w:type="spellStart"/>
             <w:r>
               <w:rPr>
                 <w:rFonts w:asciiTheme="minorHAnsi" w:hAnsiTheme="minorHAnsi" w:cstheme="minorHAnsi"/>
@@ -7291,6 +7261,7 @@
               </w:rPr>
               <w:t>nombre_actividad</w:t>
             </w:r>
+            <w:proofErr w:type="spellEnd"/>
           </w:p>
         </w:tc>
         <w:tc>
@@ -7685,6 +7656,7 @@
                 <w:szCs w:val="18"/>
               </w:rPr>
             </w:pPr>
+            <w:proofErr w:type="spellStart"/>
             <w:r>
               <w:rPr>
                 <w:rFonts w:asciiTheme="minorHAnsi" w:hAnsiTheme="minorHAnsi" w:cstheme="minorHAnsi"/>
@@ -7693,6 +7665,7 @@
               </w:rPr>
               <w:t>cod_fct</w:t>
             </w:r>
+            <w:proofErr w:type="spellEnd"/>
           </w:p>
         </w:tc>
         <w:tc>
@@ -7806,6 +7779,7 @@
                 <w:szCs w:val="18"/>
               </w:rPr>
             </w:pPr>
+            <w:proofErr w:type="spellStart"/>
             <w:r>
               <w:rPr>
                 <w:rFonts w:asciiTheme="minorHAnsi" w:hAnsiTheme="minorHAnsi" w:cstheme="minorHAnsi"/>
@@ -7814,6 +7788,7 @@
               </w:rPr>
               <w:t>Autoincremental</w:t>
             </w:r>
+            <w:proofErr w:type="spellEnd"/>
           </w:p>
         </w:tc>
       </w:tr>
@@ -7841,6 +7816,7 @@
                 <w:szCs w:val="18"/>
               </w:rPr>
             </w:pPr>
+            <w:proofErr w:type="spellStart"/>
             <w:r>
               <w:rPr>
                 <w:rFonts w:asciiTheme="minorHAnsi" w:hAnsiTheme="minorHAnsi" w:cstheme="minorHAnsi"/>
@@ -7849,6 +7825,7 @@
               </w:rPr>
               <w:t>cif_empresa</w:t>
             </w:r>
+            <w:proofErr w:type="spellEnd"/>
           </w:p>
         </w:tc>
         <w:tc>
@@ -7948,7 +7925,43 @@
                 <w:sz w:val="18"/>
                 <w:szCs w:val="18"/>
               </w:rPr>
-              <w:t>FK – references EMPRESA(cif)</w:t>
+              <w:t xml:space="preserve">FK – </w:t>
+            </w:r>
+            <w:proofErr w:type="spellStart"/>
+            <w:r>
+              <w:rPr>
+                <w:rFonts w:asciiTheme="minorHAnsi" w:hAnsiTheme="minorHAnsi" w:cstheme="minorHAnsi"/>
+                <w:sz w:val="18"/>
+                <w:szCs w:val="18"/>
+              </w:rPr>
+              <w:t>references</w:t>
+            </w:r>
+            <w:proofErr w:type="spellEnd"/>
+            <w:r>
+              <w:rPr>
+                <w:rFonts w:asciiTheme="minorHAnsi" w:hAnsiTheme="minorHAnsi" w:cstheme="minorHAnsi"/>
+                <w:sz w:val="18"/>
+                <w:szCs w:val="18"/>
+              </w:rPr>
+              <w:t xml:space="preserve"> EMPRESA(</w:t>
+            </w:r>
+            <w:proofErr w:type="spellStart"/>
+            <w:r>
+              <w:rPr>
+                <w:rFonts w:asciiTheme="minorHAnsi" w:hAnsiTheme="minorHAnsi" w:cstheme="minorHAnsi"/>
+                <w:sz w:val="18"/>
+                <w:szCs w:val="18"/>
+              </w:rPr>
+              <w:t>cif</w:t>
+            </w:r>
+            <w:proofErr w:type="spellEnd"/>
+            <w:r>
+              <w:rPr>
+                <w:rFonts w:asciiTheme="minorHAnsi" w:hAnsiTheme="minorHAnsi" w:cstheme="minorHAnsi"/>
+                <w:sz w:val="18"/>
+                <w:szCs w:val="18"/>
+              </w:rPr>
+              <w:t>)</w:t>
             </w:r>
           </w:p>
           <w:p>
@@ -7995,6 +8008,7 @@
                 <w:szCs w:val="18"/>
               </w:rPr>
             </w:pPr>
+            <w:proofErr w:type="spellStart"/>
             <w:r>
               <w:rPr>
                 <w:rFonts w:asciiTheme="minorHAnsi" w:hAnsiTheme="minorHAnsi" w:cstheme="minorHAnsi"/>
@@ -8003,6 +8017,7 @@
               </w:rPr>
               <w:t>cod_actividad</w:t>
             </w:r>
+            <w:proofErr w:type="spellEnd"/>
           </w:p>
         </w:tc>
         <w:tc>
@@ -8101,7 +8116,43 @@
                 <w:sz w:val="18"/>
                 <w:szCs w:val="18"/>
               </w:rPr>
-              <w:t>FK – references ACTIVIDAD_LABORAL(cod_actividad)</w:t>
+              <w:t xml:space="preserve">FK – </w:t>
+            </w:r>
+            <w:proofErr w:type="spellStart"/>
+            <w:r>
+              <w:rPr>
+                <w:rFonts w:asciiTheme="minorHAnsi" w:hAnsiTheme="minorHAnsi" w:cstheme="minorHAnsi"/>
+                <w:sz w:val="18"/>
+                <w:szCs w:val="18"/>
+              </w:rPr>
+              <w:t>references</w:t>
+            </w:r>
+            <w:proofErr w:type="spellEnd"/>
+            <w:r>
+              <w:rPr>
+                <w:rFonts w:asciiTheme="minorHAnsi" w:hAnsiTheme="minorHAnsi" w:cstheme="minorHAnsi"/>
+                <w:sz w:val="18"/>
+                <w:szCs w:val="18"/>
+              </w:rPr>
+              <w:t xml:space="preserve"> ACTIVIDAD_LABORAL(</w:t>
+            </w:r>
+            <w:proofErr w:type="spellStart"/>
+            <w:r>
+              <w:rPr>
+                <w:rFonts w:asciiTheme="minorHAnsi" w:hAnsiTheme="minorHAnsi" w:cstheme="minorHAnsi"/>
+                <w:sz w:val="18"/>
+                <w:szCs w:val="18"/>
+              </w:rPr>
+              <w:t>cod_actividad</w:t>
+            </w:r>
+            <w:proofErr w:type="spellEnd"/>
+            <w:r>
+              <w:rPr>
+                <w:rFonts w:asciiTheme="minorHAnsi" w:hAnsiTheme="minorHAnsi" w:cstheme="minorHAnsi"/>
+                <w:sz w:val="18"/>
+                <w:szCs w:val="18"/>
+              </w:rPr>
+              <w:t>)</w:t>
             </w:r>
           </w:p>
           <w:p>
@@ -8301,6 +8352,7 @@
                 <w:szCs w:val="18"/>
               </w:rPr>
             </w:pPr>
+            <w:proofErr w:type="spellStart"/>
             <w:r>
               <w:rPr>
                 <w:rFonts w:asciiTheme="minorHAnsi" w:hAnsiTheme="minorHAnsi" w:cstheme="minorHAnsi"/>
@@ -8309,6 +8361,7 @@
               </w:rPr>
               <w:t>Anno</w:t>
             </w:r>
+            <w:proofErr w:type="spellEnd"/>
           </w:p>
         </w:tc>
         <w:tc>
@@ -9316,7 +9369,79 @@
           <w:sz w:val="22"/>
           <w:szCs w:val="22"/>
         </w:rPr>
-        <w:t>, se convierte a tabla en el diseño lógico, siendo su clave primaria, compuesta por los atributos: dni_alumno; cif_empresa; fecha_ini. Se incluye el atributo “fecha_ini” debido a que un alumno puede haber trabajado en la misma empresa en distintas fechas. No se contempla el atributo clave foránea, que referencia a la entidad ACTIVIDAD LABORAL, debido a que tiene una cardinalidad máxima de 1.</w:t>
+        <w:t xml:space="preserve">, se convierte a tabla en el diseño lógico, siendo su clave primaria, compuesta por los atributos: </w:t>
+      </w:r>
+      <w:proofErr w:type="spellStart"/>
+      <w:r>
+        <w:rPr>
+          <w:rFonts w:asciiTheme="minorHAnsi" w:hAnsiTheme="minorHAnsi" w:cstheme="minorHAnsi"/>
+          <w:sz w:val="22"/>
+          <w:szCs w:val="22"/>
+        </w:rPr>
+        <w:t>dni_alumno</w:t>
+      </w:r>
+      <w:proofErr w:type="spellEnd"/>
+      <w:r>
+        <w:rPr>
+          <w:rFonts w:asciiTheme="minorHAnsi" w:hAnsiTheme="minorHAnsi" w:cstheme="minorHAnsi"/>
+          <w:sz w:val="22"/>
+          <w:szCs w:val="22"/>
+        </w:rPr>
+        <w:t xml:space="preserve">; </w:t>
+      </w:r>
+      <w:proofErr w:type="spellStart"/>
+      <w:r>
+        <w:rPr>
+          <w:rFonts w:asciiTheme="minorHAnsi" w:hAnsiTheme="minorHAnsi" w:cstheme="minorHAnsi"/>
+          <w:sz w:val="22"/>
+          <w:szCs w:val="22"/>
+        </w:rPr>
+        <w:t>cif_empresa</w:t>
+      </w:r>
+      <w:proofErr w:type="spellEnd"/>
+      <w:r>
+        <w:rPr>
+          <w:rFonts w:asciiTheme="minorHAnsi" w:hAnsiTheme="minorHAnsi" w:cstheme="minorHAnsi"/>
+          <w:sz w:val="22"/>
+          <w:szCs w:val="22"/>
+        </w:rPr>
+        <w:t xml:space="preserve">; </w:t>
+      </w:r>
+      <w:proofErr w:type="spellStart"/>
+      <w:r>
+        <w:rPr>
+          <w:rFonts w:asciiTheme="minorHAnsi" w:hAnsiTheme="minorHAnsi" w:cstheme="minorHAnsi"/>
+          <w:sz w:val="22"/>
+          <w:szCs w:val="22"/>
+        </w:rPr>
+        <w:t>fecha_ini</w:t>
+      </w:r>
+      <w:proofErr w:type="spellEnd"/>
+      <w:r>
+        <w:rPr>
+          <w:rFonts w:asciiTheme="minorHAnsi" w:hAnsiTheme="minorHAnsi" w:cstheme="minorHAnsi"/>
+          <w:sz w:val="22"/>
+          <w:szCs w:val="22"/>
+        </w:rPr>
+        <w:t>. Se incluye el atributo “</w:t>
+      </w:r>
+      <w:proofErr w:type="spellStart"/>
+      <w:r>
+        <w:rPr>
+          <w:rFonts w:asciiTheme="minorHAnsi" w:hAnsiTheme="minorHAnsi" w:cstheme="minorHAnsi"/>
+          <w:sz w:val="22"/>
+          <w:szCs w:val="22"/>
+        </w:rPr>
+        <w:t>fecha_ini</w:t>
+      </w:r>
+      <w:proofErr w:type="spellEnd"/>
+      <w:r>
+        <w:rPr>
+          <w:rFonts w:asciiTheme="minorHAnsi" w:hAnsiTheme="minorHAnsi" w:cstheme="minorHAnsi"/>
+          <w:sz w:val="22"/>
+          <w:szCs w:val="22"/>
+        </w:rPr>
+        <w:t>” debido a que un alumno puede haber trabajado en la misma empresa en distintas fechas. No se contempla el atributo clave foránea, que referencia a la entidad ACTIVIDAD LABORAL, debido a que tiene una cardinalidad máxima de 1.</w:t>
       </w:r>
     </w:p>
     <w:p>
@@ -9411,7 +9536,43 @@
           <w:sz w:val="22"/>
           <w:szCs w:val="22"/>
         </w:rPr>
-        <w:t>: cod_actividad y cif_empresa,</w:t>
+        <w:t xml:space="preserve">: </w:t>
+      </w:r>
+      <w:proofErr w:type="spellStart"/>
+      <w:r>
+        <w:rPr>
+          <w:rFonts w:asciiTheme="minorHAnsi" w:hAnsiTheme="minorHAnsi" w:cstheme="minorHAnsi"/>
+          <w:sz w:val="22"/>
+          <w:szCs w:val="22"/>
+        </w:rPr>
+        <w:t>cod_actividad</w:t>
+      </w:r>
+      <w:proofErr w:type="spellEnd"/>
+      <w:r>
+        <w:rPr>
+          <w:rFonts w:asciiTheme="minorHAnsi" w:hAnsiTheme="minorHAnsi" w:cstheme="minorHAnsi"/>
+          <w:sz w:val="22"/>
+          <w:szCs w:val="22"/>
+        </w:rPr>
+        <w:t xml:space="preserve"> y </w:t>
+      </w:r>
+      <w:proofErr w:type="spellStart"/>
+      <w:r>
+        <w:rPr>
+          <w:rFonts w:asciiTheme="minorHAnsi" w:hAnsiTheme="minorHAnsi" w:cstheme="minorHAnsi"/>
+          <w:sz w:val="22"/>
+          <w:szCs w:val="22"/>
+        </w:rPr>
+        <w:t>cif_empresa</w:t>
+      </w:r>
+      <w:proofErr w:type="spellEnd"/>
+      <w:r>
+        <w:rPr>
+          <w:rFonts w:asciiTheme="minorHAnsi" w:hAnsiTheme="minorHAnsi" w:cstheme="minorHAnsi"/>
+          <w:sz w:val="22"/>
+          <w:szCs w:val="22"/>
+        </w:rPr>
+        <w:t>,</w:t>
       </w:r>
       <w:r>
         <w:rPr>
@@ -10000,7 +10161,25 @@
           <w:sz w:val="22"/>
           <w:szCs w:val="22"/>
         </w:rPr>
-        <w:t>, aunque no esta indicado en los requisitos, ya que no incluye este dato</w:t>
+        <w:t xml:space="preserve">, aunque no </w:t>
+      </w:r>
+      <w:proofErr w:type="spellStart"/>
+      <w:r>
+        <w:rPr>
+          <w:rFonts w:asciiTheme="minorHAnsi" w:hAnsiTheme="minorHAnsi" w:cstheme="minorHAnsi"/>
+          <w:sz w:val="22"/>
+          <w:szCs w:val="22"/>
+        </w:rPr>
+        <w:t>esta</w:t>
+      </w:r>
+      <w:proofErr w:type="spellEnd"/>
+      <w:r>
+        <w:rPr>
+          <w:rFonts w:asciiTheme="minorHAnsi" w:hAnsiTheme="minorHAnsi" w:cstheme="minorHAnsi"/>
+          <w:sz w:val="22"/>
+          <w:szCs w:val="22"/>
+        </w:rPr>
+        <w:t xml:space="preserve"> indicado en los requisitos, ya que no incluye este dato</w:t>
       </w:r>
       <w:r>
         <w:rPr>
@@ -10132,18 +10311,63 @@
         </w:rPr>
       </w:pPr>
     </w:p>
-    <w:p/>
-    <w:p/>
-    <w:p/>
-    <w:p/>
-    <w:p/>
-    <w:p/>
-    <w:p/>
+    <w:p>
+      <w:pPr>
+        <w:rPr>
+          <w:rFonts w:hint="eastAsia"/>
+        </w:rPr>
+      </w:pPr>
+    </w:p>
+    <w:p>
+      <w:pPr>
+        <w:rPr>
+          <w:rFonts w:hint="eastAsia"/>
+        </w:rPr>
+      </w:pPr>
+    </w:p>
+    <w:p>
+      <w:pPr>
+        <w:rPr>
+          <w:rFonts w:hint="eastAsia"/>
+        </w:rPr>
+      </w:pPr>
+    </w:p>
+    <w:p>
+      <w:pPr>
+        <w:rPr>
+          <w:rFonts w:hint="eastAsia"/>
+        </w:rPr>
+      </w:pPr>
+    </w:p>
+    <w:p>
+      <w:pPr>
+        <w:rPr>
+          <w:rFonts w:hint="eastAsia"/>
+        </w:rPr>
+      </w:pPr>
+    </w:p>
+    <w:p>
+      <w:pPr>
+        <w:rPr>
+          <w:rFonts w:hint="eastAsia"/>
+        </w:rPr>
+      </w:pPr>
+    </w:p>
+    <w:p>
+      <w:pPr>
+        <w:rPr>
+          <w:rFonts w:hint="eastAsia"/>
+        </w:rPr>
+      </w:pPr>
+    </w:p>
     <w:p>
       <w:pPr>
         <w:tabs>
           <w:tab w:val="left" w:pos="6180"/>
         </w:tabs>
+        <w:rPr>
+          <w:rFonts w:hint="eastAsia"/>
+        </w:rPr>
       </w:pPr>
       <w:r>
         <w:rPr>
@@ -10157,6 +10381,9 @@
         <w:tabs>
           <w:tab w:val="left" w:pos="6180"/>
         </w:tabs>
+        <w:rPr>
+          <w:rFonts w:hint="eastAsia"/>
+        </w:rPr>
         <w:sectPr>
           <w:footerReference w:type="default" r:id="rId8"/>
           <w:pgSz w:w="11906" w:h="16838"/>
@@ -10325,6 +10552,7 @@
         </w:rPr>
         <w:t xml:space="preserve"> </w:t>
       </w:r>
+      <w:proofErr w:type="spellStart"/>
       <w:r>
         <w:rPr>
           <w:rFonts w:asciiTheme="minorHAnsi" w:hAnsiTheme="minorHAnsi" w:cstheme="minorHAnsi"/>
@@ -10336,30 +10564,97 @@
         </w:rPr>
         <w:t>dni</w:t>
       </w:r>
-      <w:r>
-        <w:rPr>
-          <w:rFonts w:asciiTheme="minorHAnsi" w:hAnsiTheme="minorHAnsi" w:cstheme="minorHAnsi"/>
-          <w:sz w:val="22"/>
-          <w:szCs w:val="22"/>
-        </w:rPr>
-        <w:t xml:space="preserve">, nombre, apellido1, apellido2, fecha_nacimiento, direccion, email, </w:t>
-      </w:r>
-      <w:r>
-        <w:rPr>
-          <w:rFonts w:asciiTheme="minorHAnsi" w:hAnsiTheme="minorHAnsi" w:cstheme="minorHAnsi"/>
-          <w:sz w:val="22"/>
-          <w:szCs w:val="22"/>
-        </w:rPr>
-        <w:t xml:space="preserve">cod_postal, </w:t>
-      </w:r>
-      <w:r>
-        <w:rPr>
-          <w:rFonts w:asciiTheme="minorHAnsi" w:hAnsiTheme="minorHAnsi" w:cstheme="minorHAnsi"/>
-          <w:sz w:val="22"/>
-          <w:szCs w:val="22"/>
-        </w:rPr>
-        <w:t>cod_fct, cod_proyecto</w:t>
-      </w:r>
+      <w:proofErr w:type="spellEnd"/>
+      <w:r>
+        <w:rPr>
+          <w:rFonts w:asciiTheme="minorHAnsi" w:hAnsiTheme="minorHAnsi" w:cstheme="minorHAnsi"/>
+          <w:sz w:val="22"/>
+          <w:szCs w:val="22"/>
+        </w:rPr>
+        <w:t xml:space="preserve">, nombre, apellido1, apellido2, </w:t>
+      </w:r>
+      <w:proofErr w:type="spellStart"/>
+      <w:r>
+        <w:rPr>
+          <w:rFonts w:asciiTheme="minorHAnsi" w:hAnsiTheme="minorHAnsi" w:cstheme="minorHAnsi"/>
+          <w:sz w:val="22"/>
+          <w:szCs w:val="22"/>
+        </w:rPr>
+        <w:t>fecha_nacimiento</w:t>
+      </w:r>
+      <w:proofErr w:type="spellEnd"/>
+      <w:r>
+        <w:rPr>
+          <w:rFonts w:asciiTheme="minorHAnsi" w:hAnsiTheme="minorHAnsi" w:cstheme="minorHAnsi"/>
+          <w:sz w:val="22"/>
+          <w:szCs w:val="22"/>
+        </w:rPr>
+        <w:t xml:space="preserve">, </w:t>
+      </w:r>
+      <w:proofErr w:type="spellStart"/>
+      <w:r>
+        <w:rPr>
+          <w:rFonts w:asciiTheme="minorHAnsi" w:hAnsiTheme="minorHAnsi" w:cstheme="minorHAnsi"/>
+          <w:sz w:val="22"/>
+          <w:szCs w:val="22"/>
+        </w:rPr>
+        <w:t>direccion</w:t>
+      </w:r>
+      <w:proofErr w:type="spellEnd"/>
+      <w:r>
+        <w:rPr>
+          <w:rFonts w:asciiTheme="minorHAnsi" w:hAnsiTheme="minorHAnsi" w:cstheme="minorHAnsi"/>
+          <w:sz w:val="22"/>
+          <w:szCs w:val="22"/>
+        </w:rPr>
+        <w:t xml:space="preserve">, email, </w:t>
+      </w:r>
+      <w:proofErr w:type="spellStart"/>
+      <w:r>
+        <w:rPr>
+          <w:rFonts w:asciiTheme="minorHAnsi" w:hAnsiTheme="minorHAnsi" w:cstheme="minorHAnsi"/>
+          <w:sz w:val="22"/>
+          <w:szCs w:val="22"/>
+        </w:rPr>
+        <w:t>cod_postal</w:t>
+      </w:r>
+      <w:proofErr w:type="spellEnd"/>
+      <w:r>
+        <w:rPr>
+          <w:rFonts w:asciiTheme="minorHAnsi" w:hAnsiTheme="minorHAnsi" w:cstheme="minorHAnsi"/>
+          <w:sz w:val="22"/>
+          <w:szCs w:val="22"/>
+        </w:rPr>
+        <w:t xml:space="preserve">, </w:t>
+      </w:r>
+      <w:proofErr w:type="spellStart"/>
+      <w:r>
+        <w:rPr>
+          <w:rFonts w:asciiTheme="minorHAnsi" w:hAnsiTheme="minorHAnsi" w:cstheme="minorHAnsi"/>
+          <w:sz w:val="22"/>
+          <w:szCs w:val="22"/>
+        </w:rPr>
+        <w:t>cod_fct</w:t>
+      </w:r>
+      <w:proofErr w:type="spellEnd"/>
+      <w:r>
+        <w:rPr>
+          <w:rFonts w:asciiTheme="minorHAnsi" w:hAnsiTheme="minorHAnsi" w:cstheme="minorHAnsi"/>
+          <w:sz w:val="22"/>
+          <w:szCs w:val="22"/>
+        </w:rPr>
+        <w:t xml:space="preserve">, </w:t>
+      </w:r>
+      <w:proofErr w:type="spellStart"/>
+      <w:r>
+        <w:rPr>
+          <w:rFonts w:asciiTheme="minorHAnsi" w:hAnsiTheme="minorHAnsi" w:cstheme="minorHAnsi"/>
+          <w:sz w:val="22"/>
+          <w:szCs w:val="22"/>
+        </w:rPr>
+        <w:t>cod_proyecto</w:t>
+      </w:r>
+      <w:proofErr w:type="spellEnd"/>
       <w:r>
         <w:rPr>
           <w:rFonts w:asciiTheme="minorHAnsi" w:hAnsiTheme="minorHAnsi" w:cstheme="minorHAnsi"/>
@@ -10421,6 +10716,7 @@
         </w:rPr>
         <w:t xml:space="preserve"> </w:t>
       </w:r>
+      <w:proofErr w:type="spellStart"/>
       <w:r>
         <w:rPr>
           <w:rFonts w:asciiTheme="minorHAnsi" w:hAnsiTheme="minorHAnsi" w:cstheme="minorHAnsi"/>
@@ -10432,6 +10728,7 @@
         </w:rPr>
         <w:t>dni</w:t>
       </w:r>
+      <w:proofErr w:type="spellEnd"/>
       <w:r>
         <w:rPr>
           <w:rFonts w:asciiTheme="minorHAnsi" w:hAnsiTheme="minorHAnsi" w:cstheme="minorHAnsi"/>
@@ -10474,7 +10771,43 @@
           <w:sz w:val="22"/>
           <w:szCs w:val="22"/>
         </w:rPr>
-        <w:t>{ nombre, apellido1, apellido2, fecha_nacimiento, direccion, email }</w:t>
+        <w:t xml:space="preserve">{ nombre, apellido1, apellido2, </w:t>
+      </w:r>
+      <w:proofErr w:type="spellStart"/>
+      <w:r>
+        <w:rPr>
+          <w:rFonts w:asciiTheme="minorHAnsi" w:hAnsiTheme="minorHAnsi" w:cstheme="minorHAnsi"/>
+          <w:sz w:val="22"/>
+          <w:szCs w:val="22"/>
+        </w:rPr>
+        <w:t>fecha_nacimiento</w:t>
+      </w:r>
+      <w:proofErr w:type="spellEnd"/>
+      <w:r>
+        <w:rPr>
+          <w:rFonts w:asciiTheme="minorHAnsi" w:hAnsiTheme="minorHAnsi" w:cstheme="minorHAnsi"/>
+          <w:sz w:val="22"/>
+          <w:szCs w:val="22"/>
+        </w:rPr>
+        <w:t xml:space="preserve">, </w:t>
+      </w:r>
+      <w:proofErr w:type="spellStart"/>
+      <w:r>
+        <w:rPr>
+          <w:rFonts w:asciiTheme="minorHAnsi" w:hAnsiTheme="minorHAnsi" w:cstheme="minorHAnsi"/>
+          <w:sz w:val="22"/>
+          <w:szCs w:val="22"/>
+        </w:rPr>
+        <w:t>direccion</w:t>
+      </w:r>
+      <w:proofErr w:type="spellEnd"/>
+      <w:r>
+        <w:rPr>
+          <w:rFonts w:asciiTheme="minorHAnsi" w:hAnsiTheme="minorHAnsi" w:cstheme="minorHAnsi"/>
+          <w:sz w:val="22"/>
+          <w:szCs w:val="22"/>
+        </w:rPr>
+        <w:t>, email }</w:t>
       </w:r>
     </w:p>
     <w:p>
@@ -10568,6 +10901,7 @@
         </w:rPr>
         <w:t xml:space="preserve"> </w:t>
       </w:r>
+      <w:proofErr w:type="spellStart"/>
       <w:r>
         <w:rPr>
           <w:rFonts w:asciiTheme="minorHAnsi" w:hAnsiTheme="minorHAnsi" w:cstheme="minorHAnsi"/>
@@ -10575,7 +10909,17 @@
           <w:szCs w:val="22"/>
           <w:lang w:val="en-US"/>
         </w:rPr>
-        <w:t xml:space="preserve">cod_fct } </w:t>
+        <w:t>cod_fct</w:t>
+      </w:r>
+      <w:proofErr w:type="spellEnd"/>
+      <w:r>
+        <w:rPr>
+          <w:rFonts w:asciiTheme="minorHAnsi" w:hAnsiTheme="minorHAnsi" w:cstheme="minorHAnsi"/>
+          <w:sz w:val="22"/>
+          <w:szCs w:val="22"/>
+          <w:lang w:val="en-US"/>
+        </w:rPr>
+        <w:t xml:space="preserve"> } </w:t>
       </w:r>
       <w:bookmarkStart w:id="0" w:name="_Hlk120355664"/>
       <w:r>
@@ -10585,7 +10929,27 @@
           <w:szCs w:val="22"/>
           <w:lang w:val="en-US"/>
         </w:rPr>
-        <w:t>references PRACTICAS_FCT (cod_fct)</w:t>
+        <w:t>references PRACTICAS_FCT (</w:t>
+      </w:r>
+      <w:proofErr w:type="spellStart"/>
+      <w:r>
+        <w:rPr>
+          <w:rFonts w:asciiTheme="minorHAnsi" w:hAnsiTheme="minorHAnsi" w:cstheme="minorHAnsi"/>
+          <w:sz w:val="22"/>
+          <w:szCs w:val="22"/>
+          <w:lang w:val="en-US"/>
+        </w:rPr>
+        <w:t>cod_fct</w:t>
+      </w:r>
+      <w:proofErr w:type="spellEnd"/>
+      <w:r>
+        <w:rPr>
+          <w:rFonts w:asciiTheme="minorHAnsi" w:hAnsiTheme="minorHAnsi" w:cstheme="minorHAnsi"/>
+          <w:sz w:val="22"/>
+          <w:szCs w:val="22"/>
+          <w:lang w:val="en-US"/>
+        </w:rPr>
+        <w:t>)</w:t>
       </w:r>
       <w:bookmarkEnd w:id="0"/>
     </w:p>
@@ -10635,13 +10999,41 @@
         </w:rPr>
         <w:t xml:space="preserve"> </w:t>
       </w:r>
-      <w:r>
-        <w:rPr>
-          <w:rFonts w:asciiTheme="minorHAnsi" w:hAnsiTheme="minorHAnsi" w:cstheme="minorHAnsi"/>
-          <w:sz w:val="22"/>
-          <w:szCs w:val="22"/>
-        </w:rPr>
-        <w:t xml:space="preserve">cod_proyecto } references </w:t>
+      <w:proofErr w:type="spellStart"/>
+      <w:r>
+        <w:rPr>
+          <w:rFonts w:asciiTheme="minorHAnsi" w:hAnsiTheme="minorHAnsi" w:cstheme="minorHAnsi"/>
+          <w:sz w:val="22"/>
+          <w:szCs w:val="22"/>
+        </w:rPr>
+        <w:t>cod_proyecto</w:t>
+      </w:r>
+      <w:proofErr w:type="spellEnd"/>
+      <w:r>
+        <w:rPr>
+          <w:rFonts w:asciiTheme="minorHAnsi" w:hAnsiTheme="minorHAnsi" w:cstheme="minorHAnsi"/>
+          <w:sz w:val="22"/>
+          <w:szCs w:val="22"/>
+        </w:rPr>
+        <w:t xml:space="preserve"> } </w:t>
+      </w:r>
+      <w:proofErr w:type="spellStart"/>
+      <w:r>
+        <w:rPr>
+          <w:rFonts w:asciiTheme="minorHAnsi" w:hAnsiTheme="minorHAnsi" w:cstheme="minorHAnsi"/>
+          <w:sz w:val="22"/>
+          <w:szCs w:val="22"/>
+        </w:rPr>
+        <w:t>references</w:t>
+      </w:r>
+      <w:proofErr w:type="spellEnd"/>
+      <w:r>
+        <w:rPr>
+          <w:rFonts w:asciiTheme="minorHAnsi" w:hAnsiTheme="minorHAnsi" w:cstheme="minorHAnsi"/>
+          <w:sz w:val="22"/>
+          <w:szCs w:val="22"/>
+        </w:rPr>
+        <w:t xml:space="preserve"> </w:t>
       </w:r>
       <w:r>
         <w:rPr>
@@ -10657,7 +11049,16 @@
           <w:sz w:val="22"/>
           <w:szCs w:val="22"/>
         </w:rPr>
-        <w:t xml:space="preserve"> (cod_</w:t>
+        <w:t xml:space="preserve"> (</w:t>
+      </w:r>
+      <w:proofErr w:type="spellStart"/>
+      <w:r>
+        <w:rPr>
+          <w:rFonts w:asciiTheme="minorHAnsi" w:hAnsiTheme="minorHAnsi" w:cstheme="minorHAnsi"/>
+          <w:sz w:val="22"/>
+          <w:szCs w:val="22"/>
+        </w:rPr>
+        <w:t>cod_</w:t>
       </w:r>
       <w:r>
         <w:rPr>
@@ -10667,6 +11068,7 @@
         </w:rPr>
         <w:t>proyecto</w:t>
       </w:r>
+      <w:proofErr w:type="spellEnd"/>
       <w:r>
         <w:rPr>
           <w:rFonts w:asciiTheme="minorHAnsi" w:hAnsiTheme="minorHAnsi" w:cstheme="minorHAnsi"/>
@@ -10693,7 +11095,61 @@
           <w:sz w:val="22"/>
           <w:szCs w:val="22"/>
         </w:rPr>
-        <w:t>FK: { cod_postal } references CODIGO_POSTAL (cod_postal)</w:t>
+        <w:t xml:space="preserve">FK: { </w:t>
+      </w:r>
+      <w:proofErr w:type="spellStart"/>
+      <w:r>
+        <w:rPr>
+          <w:rFonts w:asciiTheme="minorHAnsi" w:hAnsiTheme="minorHAnsi" w:cstheme="minorHAnsi"/>
+          <w:sz w:val="22"/>
+          <w:szCs w:val="22"/>
+        </w:rPr>
+        <w:t>cod_postal</w:t>
+      </w:r>
+      <w:proofErr w:type="spellEnd"/>
+      <w:r>
+        <w:rPr>
+          <w:rFonts w:asciiTheme="minorHAnsi" w:hAnsiTheme="minorHAnsi" w:cstheme="minorHAnsi"/>
+          <w:sz w:val="22"/>
+          <w:szCs w:val="22"/>
+        </w:rPr>
+        <w:t xml:space="preserve"> } </w:t>
+      </w:r>
+      <w:proofErr w:type="spellStart"/>
+      <w:r>
+        <w:rPr>
+          <w:rFonts w:asciiTheme="minorHAnsi" w:hAnsiTheme="minorHAnsi" w:cstheme="minorHAnsi"/>
+          <w:sz w:val="22"/>
+          <w:szCs w:val="22"/>
+        </w:rPr>
+        <w:t>references</w:t>
+      </w:r>
+      <w:proofErr w:type="spellEnd"/>
+      <w:r>
+        <w:rPr>
+          <w:rFonts w:asciiTheme="minorHAnsi" w:hAnsiTheme="minorHAnsi" w:cstheme="minorHAnsi"/>
+          <w:sz w:val="22"/>
+          <w:szCs w:val="22"/>
+        </w:rPr>
+        <w:t xml:space="preserve"> CODIGO_POSTAL (</w:t>
+      </w:r>
+      <w:proofErr w:type="spellStart"/>
+      <w:r>
+        <w:rPr>
+          <w:rFonts w:asciiTheme="minorHAnsi" w:hAnsiTheme="minorHAnsi" w:cstheme="minorHAnsi"/>
+          <w:sz w:val="22"/>
+          <w:szCs w:val="22"/>
+        </w:rPr>
+        <w:t>cod_postal</w:t>
+      </w:r>
+      <w:proofErr w:type="spellEnd"/>
+      <w:r>
+        <w:rPr>
+          <w:rFonts w:asciiTheme="minorHAnsi" w:hAnsiTheme="minorHAnsi" w:cstheme="minorHAnsi"/>
+          <w:sz w:val="22"/>
+          <w:szCs w:val="22"/>
+        </w:rPr>
+        <w:t>)</w:t>
       </w:r>
     </w:p>
     <w:p>
@@ -10742,6 +11198,7 @@
         </w:rPr>
         <w:t xml:space="preserve"> </w:t>
       </w:r>
+      <w:proofErr w:type="spellStart"/>
       <w:r>
         <w:rPr>
           <w:rFonts w:asciiTheme="minorHAnsi" w:hAnsiTheme="minorHAnsi" w:cstheme="minorHAnsi"/>
@@ -10753,14 +11210,34 @@
         </w:rPr>
         <w:t>cod_centro</w:t>
       </w:r>
-      <w:r>
-        <w:rPr>
-          <w:rFonts w:asciiTheme="minorHAnsi" w:hAnsiTheme="minorHAnsi" w:cstheme="minorHAnsi"/>
-          <w:sz w:val="22"/>
-          <w:szCs w:val="22"/>
-        </w:rPr>
-        <w:t xml:space="preserve">, nombre_centro, </w:t>
-      </w:r>
+      <w:proofErr w:type="spellEnd"/>
+      <w:r>
+        <w:rPr>
+          <w:rFonts w:asciiTheme="minorHAnsi" w:hAnsiTheme="minorHAnsi" w:cstheme="minorHAnsi"/>
+          <w:sz w:val="22"/>
+          <w:szCs w:val="22"/>
+        </w:rPr>
+        <w:t xml:space="preserve">, </w:t>
+      </w:r>
+      <w:proofErr w:type="spellStart"/>
+      <w:r>
+        <w:rPr>
+          <w:rFonts w:asciiTheme="minorHAnsi" w:hAnsiTheme="minorHAnsi" w:cstheme="minorHAnsi"/>
+          <w:sz w:val="22"/>
+          <w:szCs w:val="22"/>
+        </w:rPr>
+        <w:t>nombre_centro</w:t>
+      </w:r>
+      <w:proofErr w:type="spellEnd"/>
+      <w:r>
+        <w:rPr>
+          <w:rFonts w:asciiTheme="minorHAnsi" w:hAnsiTheme="minorHAnsi" w:cstheme="minorHAnsi"/>
+          <w:sz w:val="22"/>
+          <w:szCs w:val="22"/>
+        </w:rPr>
+        <w:t xml:space="preserve">, </w:t>
+      </w:r>
+      <w:proofErr w:type="spellStart"/>
       <w:r>
         <w:rPr>
           <w:rFonts w:asciiTheme="minorHAnsi" w:hAnsiTheme="minorHAnsi" w:cstheme="minorHAnsi"/>
@@ -10769,6 +11246,7 @@
         </w:rPr>
         <w:t>cod_postal</w:t>
       </w:r>
+      <w:proofErr w:type="spellEnd"/>
       <w:r>
         <w:rPr>
           <w:rFonts w:asciiTheme="minorHAnsi" w:hAnsiTheme="minorHAnsi" w:cstheme="minorHAnsi"/>
@@ -10814,6 +11292,7 @@
         </w:rPr>
         <w:t xml:space="preserve"> </w:t>
       </w:r>
+      <w:proofErr w:type="spellStart"/>
       <w:r>
         <w:rPr>
           <w:rFonts w:asciiTheme="minorHAnsi" w:hAnsiTheme="minorHAnsi" w:cstheme="minorHAnsi"/>
@@ -10825,6 +11304,7 @@
         </w:rPr>
         <w:t>cod_centro</w:t>
       </w:r>
+      <w:proofErr w:type="spellEnd"/>
       <w:r>
         <w:rPr>
           <w:rFonts w:asciiTheme="minorHAnsi" w:hAnsiTheme="minorHAnsi" w:cstheme="minorHAnsi"/>
@@ -10872,6 +11352,7 @@
         </w:rPr>
         <w:t xml:space="preserve"> </w:t>
       </w:r>
+      <w:proofErr w:type="spellStart"/>
       <w:r>
         <w:rPr>
           <w:rFonts w:asciiTheme="minorHAnsi" w:hAnsiTheme="minorHAnsi" w:cstheme="minorHAnsi"/>
@@ -10883,6 +11364,7 @@
         </w:rPr>
         <w:t>cod_centro</w:t>
       </w:r>
+      <w:proofErr w:type="spellEnd"/>
       <w:r>
         <w:rPr>
           <w:rFonts w:asciiTheme="minorHAnsi" w:hAnsiTheme="minorHAnsi" w:cstheme="minorHAnsi"/>
@@ -10909,7 +11391,25 @@
           <w:sz w:val="22"/>
           <w:szCs w:val="22"/>
         </w:rPr>
-        <w:t>VNN: { nombre_centro }</w:t>
+        <w:t xml:space="preserve">VNN: { </w:t>
+      </w:r>
+      <w:proofErr w:type="spellStart"/>
+      <w:r>
+        <w:rPr>
+          <w:rFonts w:asciiTheme="minorHAnsi" w:hAnsiTheme="minorHAnsi" w:cstheme="minorHAnsi"/>
+          <w:sz w:val="22"/>
+          <w:szCs w:val="22"/>
+        </w:rPr>
+        <w:t>nombre_centro</w:t>
+      </w:r>
+      <w:proofErr w:type="spellEnd"/>
+      <w:r>
+        <w:rPr>
+          <w:rFonts w:asciiTheme="minorHAnsi" w:hAnsiTheme="minorHAnsi" w:cstheme="minorHAnsi"/>
+          <w:sz w:val="22"/>
+          <w:szCs w:val="22"/>
+        </w:rPr>
+        <w:t xml:space="preserve"> }</w:t>
       </w:r>
     </w:p>
     <w:p>
@@ -10929,7 +11429,61 @@
           <w:sz w:val="22"/>
           <w:szCs w:val="22"/>
         </w:rPr>
-        <w:t>FK: { cod_postal } references CODIGO_POSTAL (cod_postal)</w:t>
+        <w:t xml:space="preserve">FK: { </w:t>
+      </w:r>
+      <w:proofErr w:type="spellStart"/>
+      <w:r>
+        <w:rPr>
+          <w:rFonts w:asciiTheme="minorHAnsi" w:hAnsiTheme="minorHAnsi" w:cstheme="minorHAnsi"/>
+          <w:sz w:val="22"/>
+          <w:szCs w:val="22"/>
+        </w:rPr>
+        <w:t>cod_postal</w:t>
+      </w:r>
+      <w:proofErr w:type="spellEnd"/>
+      <w:r>
+        <w:rPr>
+          <w:rFonts w:asciiTheme="minorHAnsi" w:hAnsiTheme="minorHAnsi" w:cstheme="minorHAnsi"/>
+          <w:sz w:val="22"/>
+          <w:szCs w:val="22"/>
+        </w:rPr>
+        <w:t xml:space="preserve"> } </w:t>
+      </w:r>
+      <w:proofErr w:type="spellStart"/>
+      <w:r>
+        <w:rPr>
+          <w:rFonts w:asciiTheme="minorHAnsi" w:hAnsiTheme="minorHAnsi" w:cstheme="minorHAnsi"/>
+          <w:sz w:val="22"/>
+          <w:szCs w:val="22"/>
+        </w:rPr>
+        <w:t>references</w:t>
+      </w:r>
+      <w:proofErr w:type="spellEnd"/>
+      <w:r>
+        <w:rPr>
+          <w:rFonts w:asciiTheme="minorHAnsi" w:hAnsiTheme="minorHAnsi" w:cstheme="minorHAnsi"/>
+          <w:sz w:val="22"/>
+          <w:szCs w:val="22"/>
+        </w:rPr>
+        <w:t xml:space="preserve"> CODIGO_POSTAL (</w:t>
+      </w:r>
+      <w:proofErr w:type="spellStart"/>
+      <w:r>
+        <w:rPr>
+          <w:rFonts w:asciiTheme="minorHAnsi" w:hAnsiTheme="minorHAnsi" w:cstheme="minorHAnsi"/>
+          <w:sz w:val="22"/>
+          <w:szCs w:val="22"/>
+        </w:rPr>
+        <w:t>cod_postal</w:t>
+      </w:r>
+      <w:proofErr w:type="spellEnd"/>
+      <w:r>
+        <w:rPr>
+          <w:rFonts w:asciiTheme="minorHAnsi" w:hAnsiTheme="minorHAnsi" w:cstheme="minorHAnsi"/>
+          <w:sz w:val="22"/>
+          <w:szCs w:val="22"/>
+        </w:rPr>
+        <w:t>)</w:t>
       </w:r>
     </w:p>
     <w:p>
@@ -10976,6 +11530,7 @@
         </w:rPr>
         <w:t xml:space="preserve"> </w:t>
       </w:r>
+      <w:proofErr w:type="spellStart"/>
       <w:r>
         <w:rPr>
           <w:rFonts w:asciiTheme="minorHAnsi" w:hAnsiTheme="minorHAnsi" w:cstheme="minorHAnsi"/>
@@ -10987,13 +11542,32 @@
         </w:rPr>
         <w:t>cod_titulacion</w:t>
       </w:r>
-      <w:r>
-        <w:rPr>
-          <w:rFonts w:asciiTheme="minorHAnsi" w:hAnsiTheme="minorHAnsi" w:cstheme="minorHAnsi"/>
-          <w:sz w:val="22"/>
-          <w:szCs w:val="22"/>
-        </w:rPr>
-        <w:t xml:space="preserve">, nombre_titulacion </w:t>
+      <w:proofErr w:type="spellEnd"/>
+      <w:r>
+        <w:rPr>
+          <w:rFonts w:asciiTheme="minorHAnsi" w:hAnsiTheme="minorHAnsi" w:cstheme="minorHAnsi"/>
+          <w:sz w:val="22"/>
+          <w:szCs w:val="22"/>
+        </w:rPr>
+        <w:t xml:space="preserve">, </w:t>
+      </w:r>
+      <w:proofErr w:type="spellStart"/>
+      <w:r>
+        <w:rPr>
+          <w:rFonts w:asciiTheme="minorHAnsi" w:hAnsiTheme="minorHAnsi" w:cstheme="minorHAnsi"/>
+          <w:sz w:val="22"/>
+          <w:szCs w:val="22"/>
+        </w:rPr>
+        <w:t>nombre_titulacion</w:t>
+      </w:r>
+      <w:proofErr w:type="spellEnd"/>
+      <w:r>
+        <w:rPr>
+          <w:rFonts w:asciiTheme="minorHAnsi" w:hAnsiTheme="minorHAnsi" w:cstheme="minorHAnsi"/>
+          <w:sz w:val="22"/>
+          <w:szCs w:val="22"/>
+        </w:rPr>
+        <w:t xml:space="preserve"> </w:t>
       </w:r>
       <w:r>
         <w:rPr>
@@ -11032,6 +11606,7 @@
         </w:rPr>
         <w:t xml:space="preserve"> </w:t>
       </w:r>
+      <w:proofErr w:type="spellStart"/>
       <w:r>
         <w:rPr>
           <w:rFonts w:asciiTheme="minorHAnsi" w:hAnsiTheme="minorHAnsi" w:cstheme="minorHAnsi"/>
@@ -11043,6 +11618,7 @@
         </w:rPr>
         <w:t>cod_titulacion</w:t>
       </w:r>
+      <w:proofErr w:type="spellEnd"/>
       <w:r>
         <w:rPr>
           <w:rFonts w:asciiTheme="minorHAnsi" w:hAnsiTheme="minorHAnsi" w:cstheme="minorHAnsi"/>
@@ -11090,6 +11666,7 @@
         </w:rPr>
         <w:t xml:space="preserve"> </w:t>
       </w:r>
+      <w:proofErr w:type="spellStart"/>
       <w:r>
         <w:rPr>
           <w:rFonts w:asciiTheme="minorHAnsi" w:hAnsiTheme="minorHAnsi" w:cstheme="minorHAnsi"/>
@@ -11101,6 +11678,7 @@
         </w:rPr>
         <w:t>cod_titulacion</w:t>
       </w:r>
+      <w:proofErr w:type="spellEnd"/>
       <w:r>
         <w:rPr>
           <w:rFonts w:asciiTheme="minorHAnsi" w:hAnsiTheme="minorHAnsi" w:cstheme="minorHAnsi"/>
@@ -11127,7 +11705,25 @@
           <w:sz w:val="22"/>
           <w:szCs w:val="22"/>
         </w:rPr>
-        <w:t>VNN: { nombre_titulacion }</w:t>
+        <w:t xml:space="preserve">VNN: { </w:t>
+      </w:r>
+      <w:proofErr w:type="spellStart"/>
+      <w:r>
+        <w:rPr>
+          <w:rFonts w:asciiTheme="minorHAnsi" w:hAnsiTheme="minorHAnsi" w:cstheme="minorHAnsi"/>
+          <w:sz w:val="22"/>
+          <w:szCs w:val="22"/>
+        </w:rPr>
+        <w:t>nombre_titulacion</w:t>
+      </w:r>
+      <w:proofErr w:type="spellEnd"/>
+      <w:r>
+        <w:rPr>
+          <w:rFonts w:asciiTheme="minorHAnsi" w:hAnsiTheme="minorHAnsi" w:cstheme="minorHAnsi"/>
+          <w:sz w:val="22"/>
+          <w:szCs w:val="22"/>
+        </w:rPr>
+        <w:t xml:space="preserve"> }</w:t>
       </w:r>
     </w:p>
     <w:p>
@@ -11177,6 +11773,7 @@
         </w:rPr>
         <w:t xml:space="preserve"> </w:t>
       </w:r>
+      <w:proofErr w:type="spellStart"/>
       <w:r>
         <w:rPr>
           <w:rFonts w:asciiTheme="minorHAnsi" w:hAnsiTheme="minorHAnsi" w:cstheme="minorHAnsi"/>
@@ -11197,13 +11794,86 @@
         </w:rPr>
         <w:t>od_proyecto</w:t>
       </w:r>
-      <w:r>
-        <w:rPr>
-          <w:rFonts w:asciiTheme="minorHAnsi" w:hAnsiTheme="minorHAnsi" w:cstheme="minorHAnsi"/>
-          <w:sz w:val="22"/>
-          <w:szCs w:val="22"/>
-        </w:rPr>
-        <w:t xml:space="preserve">, titulo_proyecto, descripcion, fecha_entrega, nota, dni_tutor </w:t>
+      <w:proofErr w:type="spellEnd"/>
+      <w:r>
+        <w:rPr>
+          <w:rFonts w:asciiTheme="minorHAnsi" w:hAnsiTheme="minorHAnsi" w:cstheme="minorHAnsi"/>
+          <w:sz w:val="22"/>
+          <w:szCs w:val="22"/>
+        </w:rPr>
+        <w:t xml:space="preserve">, </w:t>
+      </w:r>
+      <w:proofErr w:type="spellStart"/>
+      <w:r>
+        <w:rPr>
+          <w:rFonts w:asciiTheme="minorHAnsi" w:hAnsiTheme="minorHAnsi" w:cstheme="minorHAnsi"/>
+          <w:sz w:val="22"/>
+          <w:szCs w:val="22"/>
+        </w:rPr>
+        <w:t>titulo_proyecto</w:t>
+      </w:r>
+      <w:proofErr w:type="spellEnd"/>
+      <w:r>
+        <w:rPr>
+          <w:rFonts w:asciiTheme="minorHAnsi" w:hAnsiTheme="minorHAnsi" w:cstheme="minorHAnsi"/>
+          <w:sz w:val="22"/>
+          <w:szCs w:val="22"/>
+        </w:rPr>
+        <w:t xml:space="preserve">, </w:t>
+      </w:r>
+      <w:proofErr w:type="spellStart"/>
+      <w:r>
+        <w:rPr>
+          <w:rFonts w:asciiTheme="minorHAnsi" w:hAnsiTheme="minorHAnsi" w:cstheme="minorHAnsi"/>
+          <w:sz w:val="22"/>
+          <w:szCs w:val="22"/>
+        </w:rPr>
+        <w:t>descripcion</w:t>
+      </w:r>
+      <w:proofErr w:type="spellEnd"/>
+      <w:r>
+        <w:rPr>
+          <w:rFonts w:asciiTheme="minorHAnsi" w:hAnsiTheme="minorHAnsi" w:cstheme="minorHAnsi"/>
+          <w:sz w:val="22"/>
+          <w:szCs w:val="22"/>
+        </w:rPr>
+        <w:t xml:space="preserve">, </w:t>
+      </w:r>
+      <w:proofErr w:type="spellStart"/>
+      <w:r>
+        <w:rPr>
+          <w:rFonts w:asciiTheme="minorHAnsi" w:hAnsiTheme="minorHAnsi" w:cstheme="minorHAnsi"/>
+          <w:sz w:val="22"/>
+          <w:szCs w:val="22"/>
+        </w:rPr>
+        <w:t>fecha_entrega</w:t>
+      </w:r>
+      <w:proofErr w:type="spellEnd"/>
+      <w:r>
+        <w:rPr>
+          <w:rFonts w:asciiTheme="minorHAnsi" w:hAnsiTheme="minorHAnsi" w:cstheme="minorHAnsi"/>
+          <w:sz w:val="22"/>
+          <w:szCs w:val="22"/>
+        </w:rPr>
+        <w:t xml:space="preserve">, nota, </w:t>
+      </w:r>
+      <w:proofErr w:type="spellStart"/>
+      <w:r>
+        <w:rPr>
+          <w:rFonts w:asciiTheme="minorHAnsi" w:hAnsiTheme="minorHAnsi" w:cstheme="minorHAnsi"/>
+          <w:sz w:val="22"/>
+          <w:szCs w:val="22"/>
+        </w:rPr>
+        <w:t>dni_tutor</w:t>
+      </w:r>
+      <w:proofErr w:type="spellEnd"/>
+      <w:r>
+        <w:rPr>
+          <w:rFonts w:asciiTheme="minorHAnsi" w:hAnsiTheme="minorHAnsi" w:cstheme="minorHAnsi"/>
+          <w:sz w:val="22"/>
+          <w:szCs w:val="22"/>
+        </w:rPr>
+        <w:t xml:space="preserve"> </w:t>
       </w:r>
       <w:r>
         <w:rPr>
@@ -11242,6 +11912,7 @@
         </w:rPr>
         <w:t xml:space="preserve"> </w:t>
       </w:r>
+      <w:proofErr w:type="spellStart"/>
       <w:r>
         <w:rPr>
           <w:rFonts w:asciiTheme="minorHAnsi" w:hAnsiTheme="minorHAnsi" w:cstheme="minorHAnsi"/>
@@ -11262,6 +11933,7 @@
         </w:rPr>
         <w:t>od_proyecto</w:t>
       </w:r>
+      <w:proofErr w:type="spellEnd"/>
       <w:r>
         <w:rPr>
           <w:rFonts w:asciiTheme="minorHAnsi" w:hAnsiTheme="minorHAnsi" w:cstheme="minorHAnsi"/>
@@ -11309,6 +11981,7 @@
         </w:rPr>
         <w:t xml:space="preserve"> </w:t>
       </w:r>
+      <w:proofErr w:type="spellStart"/>
       <w:r>
         <w:rPr>
           <w:rFonts w:asciiTheme="minorHAnsi" w:hAnsiTheme="minorHAnsi" w:cstheme="minorHAnsi"/>
@@ -11329,6 +12002,7 @@
         </w:rPr>
         <w:t>od_proyecto</w:t>
       </w:r>
+      <w:proofErr w:type="spellEnd"/>
       <w:r>
         <w:rPr>
           <w:rFonts w:asciiTheme="minorHAnsi" w:hAnsiTheme="minorHAnsi" w:cstheme="minorHAnsi"/>
@@ -11355,7 +12029,43 @@
           <w:sz w:val="22"/>
           <w:szCs w:val="22"/>
         </w:rPr>
-        <w:t>VNN: { titulo_proyecto, descripcion }</w:t>
+        <w:t xml:space="preserve">VNN: { </w:t>
+      </w:r>
+      <w:proofErr w:type="spellStart"/>
+      <w:r>
+        <w:rPr>
+          <w:rFonts w:asciiTheme="minorHAnsi" w:hAnsiTheme="minorHAnsi" w:cstheme="minorHAnsi"/>
+          <w:sz w:val="22"/>
+          <w:szCs w:val="22"/>
+        </w:rPr>
+        <w:t>titulo_proyecto</w:t>
+      </w:r>
+      <w:proofErr w:type="spellEnd"/>
+      <w:r>
+        <w:rPr>
+          <w:rFonts w:asciiTheme="minorHAnsi" w:hAnsiTheme="minorHAnsi" w:cstheme="minorHAnsi"/>
+          <w:sz w:val="22"/>
+          <w:szCs w:val="22"/>
+        </w:rPr>
+        <w:t xml:space="preserve">, </w:t>
+      </w:r>
+      <w:proofErr w:type="spellStart"/>
+      <w:r>
+        <w:rPr>
+          <w:rFonts w:asciiTheme="minorHAnsi" w:hAnsiTheme="minorHAnsi" w:cstheme="minorHAnsi"/>
+          <w:sz w:val="22"/>
+          <w:szCs w:val="22"/>
+        </w:rPr>
+        <w:t>descripcion</w:t>
+      </w:r>
+      <w:proofErr w:type="spellEnd"/>
+      <w:r>
+        <w:rPr>
+          <w:rFonts w:asciiTheme="minorHAnsi" w:hAnsiTheme="minorHAnsi" w:cstheme="minorHAnsi"/>
+          <w:sz w:val="22"/>
+          <w:szCs w:val="22"/>
+        </w:rPr>
+        <w:t xml:space="preserve"> }</w:t>
       </w:r>
     </w:p>
     <w:p>
@@ -11375,15 +12085,43 @@
           <w:sz w:val="22"/>
           <w:szCs w:val="22"/>
         </w:rPr>
-        <w:t xml:space="preserve">Puede ser null: { </w:t>
-      </w:r>
-      <w:r>
-        <w:rPr>
-          <w:rFonts w:asciiTheme="minorHAnsi" w:hAnsiTheme="minorHAnsi" w:cstheme="minorHAnsi"/>
-          <w:sz w:val="22"/>
-          <w:szCs w:val="22"/>
-        </w:rPr>
-        <w:t>fecha_entrega, nota</w:t>
+        <w:t xml:space="preserve">Puede ser </w:t>
+      </w:r>
+      <w:proofErr w:type="spellStart"/>
+      <w:r>
+        <w:rPr>
+          <w:rFonts w:asciiTheme="minorHAnsi" w:hAnsiTheme="minorHAnsi" w:cstheme="minorHAnsi"/>
+          <w:sz w:val="22"/>
+          <w:szCs w:val="22"/>
+        </w:rPr>
+        <w:t>null</w:t>
+      </w:r>
+      <w:proofErr w:type="spellEnd"/>
+      <w:r>
+        <w:rPr>
+          <w:rFonts w:asciiTheme="minorHAnsi" w:hAnsiTheme="minorHAnsi" w:cstheme="minorHAnsi"/>
+          <w:sz w:val="22"/>
+          <w:szCs w:val="22"/>
+        </w:rPr>
+        <w:t xml:space="preserve">: { </w:t>
+      </w:r>
+      <w:proofErr w:type="spellStart"/>
+      <w:r>
+        <w:rPr>
+          <w:rFonts w:asciiTheme="minorHAnsi" w:hAnsiTheme="minorHAnsi" w:cstheme="minorHAnsi"/>
+          <w:sz w:val="22"/>
+          <w:szCs w:val="22"/>
+        </w:rPr>
+        <w:t>fecha_entrega</w:t>
+      </w:r>
+      <w:proofErr w:type="spellEnd"/>
+      <w:r>
+        <w:rPr>
+          <w:rFonts w:asciiTheme="minorHAnsi" w:hAnsiTheme="minorHAnsi" w:cstheme="minorHAnsi"/>
+          <w:sz w:val="22"/>
+          <w:szCs w:val="22"/>
+        </w:rPr>
+        <w:t>, nota</w:t>
       </w:r>
       <w:r>
         <w:rPr>
@@ -11411,15 +12149,43 @@
           <w:sz w:val="22"/>
           <w:szCs w:val="22"/>
         </w:rPr>
-        <w:t xml:space="preserve">FK: { dni_tutor } </w:t>
-      </w:r>
-      <w:r>
-        <w:rPr>
-          <w:rFonts w:asciiTheme="minorHAnsi" w:hAnsiTheme="minorHAnsi" w:cstheme="minorHAnsi"/>
-          <w:sz w:val="22"/>
-          <w:szCs w:val="22"/>
-        </w:rPr>
-        <w:t xml:space="preserve">references </w:t>
+        <w:t xml:space="preserve">FK: { </w:t>
+      </w:r>
+      <w:proofErr w:type="spellStart"/>
+      <w:r>
+        <w:rPr>
+          <w:rFonts w:asciiTheme="minorHAnsi" w:hAnsiTheme="minorHAnsi" w:cstheme="minorHAnsi"/>
+          <w:sz w:val="22"/>
+          <w:szCs w:val="22"/>
+        </w:rPr>
+        <w:t>dni_tutor</w:t>
+      </w:r>
+      <w:proofErr w:type="spellEnd"/>
+      <w:r>
+        <w:rPr>
+          <w:rFonts w:asciiTheme="minorHAnsi" w:hAnsiTheme="minorHAnsi" w:cstheme="minorHAnsi"/>
+          <w:sz w:val="22"/>
+          <w:szCs w:val="22"/>
+        </w:rPr>
+        <w:t xml:space="preserve"> } </w:t>
+      </w:r>
+      <w:proofErr w:type="spellStart"/>
+      <w:r>
+        <w:rPr>
+          <w:rFonts w:asciiTheme="minorHAnsi" w:hAnsiTheme="minorHAnsi" w:cstheme="minorHAnsi"/>
+          <w:sz w:val="22"/>
+          <w:szCs w:val="22"/>
+        </w:rPr>
+        <w:t>references</w:t>
+      </w:r>
+      <w:proofErr w:type="spellEnd"/>
+      <w:r>
+        <w:rPr>
+          <w:rFonts w:asciiTheme="minorHAnsi" w:hAnsiTheme="minorHAnsi" w:cstheme="minorHAnsi"/>
+          <w:sz w:val="22"/>
+          <w:szCs w:val="22"/>
+        </w:rPr>
+        <w:t xml:space="preserve"> </w:t>
       </w:r>
       <w:r>
         <w:rPr>
@@ -11437,6 +12203,7 @@
         </w:rPr>
         <w:t xml:space="preserve"> (</w:t>
       </w:r>
+      <w:proofErr w:type="spellStart"/>
       <w:r>
         <w:rPr>
           <w:rFonts w:asciiTheme="minorHAnsi" w:hAnsiTheme="minorHAnsi" w:cstheme="minorHAnsi"/>
@@ -11445,6 +12212,7 @@
         </w:rPr>
         <w:t>dni</w:t>
       </w:r>
+      <w:proofErr w:type="spellEnd"/>
       <w:r>
         <w:rPr>
           <w:rFonts w:asciiTheme="minorHAnsi" w:hAnsiTheme="minorHAnsi" w:cstheme="minorHAnsi"/>
@@ -11500,6 +12268,7 @@
         </w:rPr>
         <w:t xml:space="preserve"> </w:t>
       </w:r>
+      <w:proofErr w:type="spellStart"/>
       <w:r>
         <w:rPr>
           <w:rFonts w:asciiTheme="minorHAnsi" w:hAnsiTheme="minorHAnsi" w:cstheme="minorHAnsi"/>
@@ -11510,6 +12279,7 @@
         </w:rPr>
         <w:t>dni</w:t>
       </w:r>
+      <w:proofErr w:type="spellEnd"/>
       <w:r>
         <w:rPr>
           <w:rFonts w:asciiTheme="minorHAnsi" w:hAnsiTheme="minorHAnsi" w:cstheme="minorHAnsi"/>
@@ -11555,6 +12325,7 @@
         </w:rPr>
         <w:t xml:space="preserve"> </w:t>
       </w:r>
+      <w:proofErr w:type="spellStart"/>
       <w:r>
         <w:rPr>
           <w:rFonts w:asciiTheme="minorHAnsi" w:hAnsiTheme="minorHAnsi" w:cstheme="minorHAnsi"/>
@@ -11565,6 +12336,7 @@
         </w:rPr>
         <w:t>dni</w:t>
       </w:r>
+      <w:proofErr w:type="spellEnd"/>
       <w:r>
         <w:rPr>
           <w:rFonts w:asciiTheme="minorHAnsi" w:hAnsiTheme="minorHAnsi" w:cstheme="minorHAnsi"/>
@@ -11667,6 +12439,7 @@
         </w:rPr>
         <w:t xml:space="preserve"> </w:t>
       </w:r>
+      <w:proofErr w:type="spellStart"/>
       <w:r>
         <w:rPr>
           <w:rFonts w:asciiTheme="minorHAnsi" w:hAnsiTheme="minorHAnsi" w:cstheme="minorHAnsi"/>
@@ -11677,13 +12450,32 @@
         </w:rPr>
         <w:t>cif</w:t>
       </w:r>
-      <w:r>
-        <w:rPr>
-          <w:rFonts w:asciiTheme="minorHAnsi" w:hAnsiTheme="minorHAnsi" w:cstheme="minorHAnsi"/>
-          <w:sz w:val="22"/>
-          <w:szCs w:val="22"/>
-        </w:rPr>
-        <w:t xml:space="preserve">, nombre, num_convenio, dirección, </w:t>
+      <w:proofErr w:type="spellEnd"/>
+      <w:r>
+        <w:rPr>
+          <w:rFonts w:asciiTheme="minorHAnsi" w:hAnsiTheme="minorHAnsi" w:cstheme="minorHAnsi"/>
+          <w:sz w:val="22"/>
+          <w:szCs w:val="22"/>
+        </w:rPr>
+        <w:t xml:space="preserve">, nombre, </w:t>
+      </w:r>
+      <w:proofErr w:type="spellStart"/>
+      <w:r>
+        <w:rPr>
+          <w:rFonts w:asciiTheme="minorHAnsi" w:hAnsiTheme="minorHAnsi" w:cstheme="minorHAnsi"/>
+          <w:sz w:val="22"/>
+          <w:szCs w:val="22"/>
+        </w:rPr>
+        <w:t>num_convenio</w:t>
+      </w:r>
+      <w:proofErr w:type="spellEnd"/>
+      <w:r>
+        <w:rPr>
+          <w:rFonts w:asciiTheme="minorHAnsi" w:hAnsiTheme="minorHAnsi" w:cstheme="minorHAnsi"/>
+          <w:sz w:val="22"/>
+          <w:szCs w:val="22"/>
+        </w:rPr>
+        <w:t xml:space="preserve">, dirección, </w:t>
       </w:r>
       <w:r>
         <w:rPr>
@@ -11699,7 +12491,25 @@
           <w:sz w:val="22"/>
           <w:szCs w:val="22"/>
         </w:rPr>
-        <w:t xml:space="preserve">, cod_postal </w:t>
+        <w:t xml:space="preserve">, </w:t>
+      </w:r>
+      <w:proofErr w:type="spellStart"/>
+      <w:r>
+        <w:rPr>
+          <w:rFonts w:asciiTheme="minorHAnsi" w:hAnsiTheme="minorHAnsi" w:cstheme="minorHAnsi"/>
+          <w:sz w:val="22"/>
+          <w:szCs w:val="22"/>
+        </w:rPr>
+        <w:t>cod_postal</w:t>
+      </w:r>
+      <w:proofErr w:type="spellEnd"/>
+      <w:r>
+        <w:rPr>
+          <w:rFonts w:asciiTheme="minorHAnsi" w:hAnsiTheme="minorHAnsi" w:cstheme="minorHAnsi"/>
+          <w:sz w:val="22"/>
+          <w:szCs w:val="22"/>
+        </w:rPr>
+        <w:t xml:space="preserve"> </w:t>
       </w:r>
       <w:r>
         <w:rPr>
@@ -11738,6 +12548,7 @@
         </w:rPr>
         <w:t xml:space="preserve"> </w:t>
       </w:r>
+      <w:proofErr w:type="spellStart"/>
       <w:r>
         <w:rPr>
           <w:rFonts w:asciiTheme="minorHAnsi" w:hAnsiTheme="minorHAnsi" w:cstheme="minorHAnsi"/>
@@ -11749,6 +12560,7 @@
         </w:rPr>
         <w:t>cif</w:t>
       </w:r>
+      <w:proofErr w:type="spellEnd"/>
       <w:r>
         <w:rPr>
           <w:rFonts w:asciiTheme="minorHAnsi" w:hAnsiTheme="minorHAnsi" w:cstheme="minorHAnsi"/>
@@ -11815,7 +12627,43 @@
           <w:sz w:val="22"/>
           <w:szCs w:val="22"/>
         </w:rPr>
-        <w:t>Puede ser null: { num_convenio }</w:t>
+        <w:t xml:space="preserve">Puede ser </w:t>
+      </w:r>
+      <w:proofErr w:type="spellStart"/>
+      <w:r>
+        <w:rPr>
+          <w:rFonts w:asciiTheme="minorHAnsi" w:hAnsiTheme="minorHAnsi" w:cstheme="minorHAnsi"/>
+          <w:sz w:val="22"/>
+          <w:szCs w:val="22"/>
+        </w:rPr>
+        <w:t>null</w:t>
+      </w:r>
+      <w:proofErr w:type="spellEnd"/>
+      <w:r>
+        <w:rPr>
+          <w:rFonts w:asciiTheme="minorHAnsi" w:hAnsiTheme="minorHAnsi" w:cstheme="minorHAnsi"/>
+          <w:sz w:val="22"/>
+          <w:szCs w:val="22"/>
+        </w:rPr>
+        <w:t xml:space="preserve">: { </w:t>
+      </w:r>
+      <w:proofErr w:type="spellStart"/>
+      <w:r>
+        <w:rPr>
+          <w:rFonts w:asciiTheme="minorHAnsi" w:hAnsiTheme="minorHAnsi" w:cstheme="minorHAnsi"/>
+          <w:sz w:val="22"/>
+          <w:szCs w:val="22"/>
+        </w:rPr>
+        <w:t>num_convenio</w:t>
+      </w:r>
+      <w:proofErr w:type="spellEnd"/>
+      <w:r>
+        <w:rPr>
+          <w:rFonts w:asciiTheme="minorHAnsi" w:hAnsiTheme="minorHAnsi" w:cstheme="minorHAnsi"/>
+          <w:sz w:val="22"/>
+          <w:szCs w:val="22"/>
+        </w:rPr>
+        <w:t xml:space="preserve"> }</w:t>
       </w:r>
     </w:p>
     <w:p>
@@ -11835,7 +12683,61 @@
           <w:sz w:val="22"/>
           <w:szCs w:val="22"/>
         </w:rPr>
-        <w:t>FK: { cod_postal } references CODIGO_POSTAL (cod_postal)</w:t>
+        <w:t xml:space="preserve">FK: { </w:t>
+      </w:r>
+      <w:proofErr w:type="spellStart"/>
+      <w:r>
+        <w:rPr>
+          <w:rFonts w:asciiTheme="minorHAnsi" w:hAnsiTheme="minorHAnsi" w:cstheme="minorHAnsi"/>
+          <w:sz w:val="22"/>
+          <w:szCs w:val="22"/>
+        </w:rPr>
+        <w:t>cod_postal</w:t>
+      </w:r>
+      <w:proofErr w:type="spellEnd"/>
+      <w:r>
+        <w:rPr>
+          <w:rFonts w:asciiTheme="minorHAnsi" w:hAnsiTheme="minorHAnsi" w:cstheme="minorHAnsi"/>
+          <w:sz w:val="22"/>
+          <w:szCs w:val="22"/>
+        </w:rPr>
+        <w:t xml:space="preserve"> } </w:t>
+      </w:r>
+      <w:proofErr w:type="spellStart"/>
+      <w:r>
+        <w:rPr>
+          <w:rFonts w:asciiTheme="minorHAnsi" w:hAnsiTheme="minorHAnsi" w:cstheme="minorHAnsi"/>
+          <w:sz w:val="22"/>
+          <w:szCs w:val="22"/>
+        </w:rPr>
+        <w:t>references</w:t>
+      </w:r>
+      <w:proofErr w:type="spellEnd"/>
+      <w:r>
+        <w:rPr>
+          <w:rFonts w:asciiTheme="minorHAnsi" w:hAnsiTheme="minorHAnsi" w:cstheme="minorHAnsi"/>
+          <w:sz w:val="22"/>
+          <w:szCs w:val="22"/>
+        </w:rPr>
+        <w:t xml:space="preserve"> CODIGO_POSTAL (</w:t>
+      </w:r>
+      <w:proofErr w:type="spellStart"/>
+      <w:r>
+        <w:rPr>
+          <w:rFonts w:asciiTheme="minorHAnsi" w:hAnsiTheme="minorHAnsi" w:cstheme="minorHAnsi"/>
+          <w:sz w:val="22"/>
+          <w:szCs w:val="22"/>
+        </w:rPr>
+        <w:t>cod_postal</w:t>
+      </w:r>
+      <w:proofErr w:type="spellEnd"/>
+      <w:r>
+        <w:rPr>
+          <w:rFonts w:asciiTheme="minorHAnsi" w:hAnsiTheme="minorHAnsi" w:cstheme="minorHAnsi"/>
+          <w:sz w:val="22"/>
+          <w:szCs w:val="22"/>
+        </w:rPr>
+        <w:t>)</w:t>
       </w:r>
     </w:p>
     <w:p>
@@ -11882,6 +12784,7 @@
         </w:rPr>
         <w:t xml:space="preserve"> </w:t>
       </w:r>
+      <w:proofErr w:type="spellStart"/>
       <w:r>
         <w:rPr>
           <w:rFonts w:asciiTheme="minorHAnsi" w:hAnsiTheme="minorHAnsi" w:cstheme="minorHAnsi"/>
@@ -11892,13 +12795,32 @@
         </w:rPr>
         <w:t>cod_actividad</w:t>
       </w:r>
-      <w:r>
-        <w:rPr>
-          <w:rFonts w:asciiTheme="minorHAnsi" w:hAnsiTheme="minorHAnsi" w:cstheme="minorHAnsi"/>
-          <w:sz w:val="22"/>
-          <w:szCs w:val="22"/>
-        </w:rPr>
-        <w:t xml:space="preserve">, nombre_actividad </w:t>
+      <w:proofErr w:type="spellEnd"/>
+      <w:r>
+        <w:rPr>
+          <w:rFonts w:asciiTheme="minorHAnsi" w:hAnsiTheme="minorHAnsi" w:cstheme="minorHAnsi"/>
+          <w:sz w:val="22"/>
+          <w:szCs w:val="22"/>
+        </w:rPr>
+        <w:t xml:space="preserve">, </w:t>
+      </w:r>
+      <w:proofErr w:type="spellStart"/>
+      <w:r>
+        <w:rPr>
+          <w:rFonts w:asciiTheme="minorHAnsi" w:hAnsiTheme="minorHAnsi" w:cstheme="minorHAnsi"/>
+          <w:sz w:val="22"/>
+          <w:szCs w:val="22"/>
+        </w:rPr>
+        <w:t>nombre_actividad</w:t>
+      </w:r>
+      <w:proofErr w:type="spellEnd"/>
+      <w:r>
+        <w:rPr>
+          <w:rFonts w:asciiTheme="minorHAnsi" w:hAnsiTheme="minorHAnsi" w:cstheme="minorHAnsi"/>
+          <w:sz w:val="22"/>
+          <w:szCs w:val="22"/>
+        </w:rPr>
+        <w:t xml:space="preserve"> </w:t>
       </w:r>
       <w:r>
         <w:rPr>
@@ -11937,6 +12859,7 @@
         </w:rPr>
         <w:t xml:space="preserve"> </w:t>
       </w:r>
+      <w:proofErr w:type="spellStart"/>
       <w:r>
         <w:rPr>
           <w:rFonts w:asciiTheme="minorHAnsi" w:hAnsiTheme="minorHAnsi" w:cstheme="minorHAnsi"/>
@@ -11947,6 +12870,7 @@
         </w:rPr>
         <w:t>cod_actividad</w:t>
       </w:r>
+      <w:proofErr w:type="spellEnd"/>
       <w:r>
         <w:rPr>
           <w:rFonts w:asciiTheme="minorHAnsi" w:hAnsiTheme="minorHAnsi" w:cstheme="minorHAnsi"/>
@@ -11994,6 +12918,7 @@
         </w:rPr>
         <w:t xml:space="preserve"> </w:t>
       </w:r>
+      <w:proofErr w:type="spellStart"/>
       <w:r>
         <w:rPr>
           <w:rFonts w:asciiTheme="minorHAnsi" w:hAnsiTheme="minorHAnsi" w:cstheme="minorHAnsi"/>
@@ -12004,6 +12929,7 @@
         </w:rPr>
         <w:t>cod_actividad</w:t>
       </w:r>
+      <w:proofErr w:type="spellEnd"/>
       <w:r>
         <w:rPr>
           <w:rFonts w:asciiTheme="minorHAnsi" w:hAnsiTheme="minorHAnsi" w:cstheme="minorHAnsi"/>
@@ -12030,7 +12956,25 @@
           <w:sz w:val="22"/>
           <w:szCs w:val="22"/>
         </w:rPr>
-        <w:t>VNN: { nombre_actividad }</w:t>
+        <w:t xml:space="preserve">VNN: { </w:t>
+      </w:r>
+      <w:proofErr w:type="spellStart"/>
+      <w:r>
+        <w:rPr>
+          <w:rFonts w:asciiTheme="minorHAnsi" w:hAnsiTheme="minorHAnsi" w:cstheme="minorHAnsi"/>
+          <w:sz w:val="22"/>
+          <w:szCs w:val="22"/>
+        </w:rPr>
+        <w:t>nombre_actividad</w:t>
+      </w:r>
+      <w:proofErr w:type="spellEnd"/>
+      <w:r>
+        <w:rPr>
+          <w:rFonts w:asciiTheme="minorHAnsi" w:hAnsiTheme="minorHAnsi" w:cstheme="minorHAnsi"/>
+          <w:sz w:val="22"/>
+          <w:szCs w:val="22"/>
+        </w:rPr>
+        <w:t xml:space="preserve"> }</w:t>
       </w:r>
     </w:p>
     <w:p>
@@ -12072,6 +13016,7 @@
         </w:rPr>
         <w:t xml:space="preserve"> ( </w:t>
       </w:r>
+      <w:proofErr w:type="spellStart"/>
       <w:r>
         <w:rPr>
           <w:rFonts w:asciiTheme="minorHAnsi" w:hAnsiTheme="minorHAnsi" w:cstheme="minorHAnsi"/>
@@ -12094,13 +13039,68 @@
         </w:rPr>
         <w:t>fct</w:t>
       </w:r>
-      <w:r>
-        <w:rPr>
-          <w:rFonts w:asciiTheme="minorHAnsi" w:hAnsiTheme="minorHAnsi" w:cstheme="minorHAnsi"/>
-          <w:sz w:val="22"/>
-          <w:szCs w:val="22"/>
-        </w:rPr>
-        <w:t xml:space="preserve">, cif_empresa, cod_actividad, convocatoria, anno </w:t>
+      <w:proofErr w:type="spellEnd"/>
+      <w:r>
+        <w:rPr>
+          <w:rFonts w:asciiTheme="minorHAnsi" w:hAnsiTheme="minorHAnsi" w:cstheme="minorHAnsi"/>
+          <w:sz w:val="22"/>
+          <w:szCs w:val="22"/>
+        </w:rPr>
+        <w:t xml:space="preserve">, </w:t>
+      </w:r>
+      <w:proofErr w:type="spellStart"/>
+      <w:r>
+        <w:rPr>
+          <w:rFonts w:asciiTheme="minorHAnsi" w:hAnsiTheme="minorHAnsi" w:cstheme="minorHAnsi"/>
+          <w:sz w:val="22"/>
+          <w:szCs w:val="22"/>
+        </w:rPr>
+        <w:t>cif_empresa</w:t>
+      </w:r>
+      <w:proofErr w:type="spellEnd"/>
+      <w:r>
+        <w:rPr>
+          <w:rFonts w:asciiTheme="minorHAnsi" w:hAnsiTheme="minorHAnsi" w:cstheme="minorHAnsi"/>
+          <w:sz w:val="22"/>
+          <w:szCs w:val="22"/>
+        </w:rPr>
+        <w:t xml:space="preserve">, </w:t>
+      </w:r>
+      <w:proofErr w:type="spellStart"/>
+      <w:r>
+        <w:rPr>
+          <w:rFonts w:asciiTheme="minorHAnsi" w:hAnsiTheme="minorHAnsi" w:cstheme="minorHAnsi"/>
+          <w:sz w:val="22"/>
+          <w:szCs w:val="22"/>
+        </w:rPr>
+        <w:t>cod_actividad</w:t>
+      </w:r>
+      <w:proofErr w:type="spellEnd"/>
+      <w:r>
+        <w:rPr>
+          <w:rFonts w:asciiTheme="minorHAnsi" w:hAnsiTheme="minorHAnsi" w:cstheme="minorHAnsi"/>
+          <w:sz w:val="22"/>
+          <w:szCs w:val="22"/>
+        </w:rPr>
+        <w:t xml:space="preserve">, convocatoria, </w:t>
+      </w:r>
+      <w:proofErr w:type="spellStart"/>
+      <w:r>
+        <w:rPr>
+          <w:rFonts w:asciiTheme="minorHAnsi" w:hAnsiTheme="minorHAnsi" w:cstheme="minorHAnsi"/>
+          <w:sz w:val="22"/>
+          <w:szCs w:val="22"/>
+        </w:rPr>
+        <w:t>anno</w:t>
+      </w:r>
+      <w:proofErr w:type="spellEnd"/>
+      <w:r>
+        <w:rPr>
+          <w:rFonts w:asciiTheme="minorHAnsi" w:hAnsiTheme="minorHAnsi" w:cstheme="minorHAnsi"/>
+          <w:sz w:val="22"/>
+          <w:szCs w:val="22"/>
+        </w:rPr>
+        <w:t xml:space="preserve"> </w:t>
       </w:r>
       <w:r>
         <w:rPr>
@@ -12139,6 +13139,7 @@
         </w:rPr>
         <w:t xml:space="preserve"> </w:t>
       </w:r>
+      <w:proofErr w:type="spellStart"/>
       <w:r>
         <w:rPr>
           <w:rFonts w:asciiTheme="minorHAnsi" w:hAnsiTheme="minorHAnsi" w:cstheme="minorHAnsi"/>
@@ -12161,6 +13162,7 @@
         </w:rPr>
         <w:t>fct</w:t>
       </w:r>
+      <w:proofErr w:type="spellEnd"/>
       <w:r>
         <w:rPr>
           <w:rFonts w:asciiTheme="minorHAnsi" w:hAnsiTheme="minorHAnsi" w:cstheme="minorHAnsi"/>
@@ -12218,6 +13220,7 @@
         </w:rPr>
         <w:t xml:space="preserve"> </w:t>
       </w:r>
+      <w:proofErr w:type="spellStart"/>
       <w:r>
         <w:rPr>
           <w:rFonts w:asciiTheme="minorHAnsi" w:hAnsiTheme="minorHAnsi" w:cstheme="minorHAnsi"/>
@@ -12240,6 +13243,7 @@
         </w:rPr>
         <w:t>fct</w:t>
       </w:r>
+      <w:proofErr w:type="spellEnd"/>
       <w:r>
         <w:rPr>
           <w:rFonts w:asciiTheme="minorHAnsi" w:hAnsiTheme="minorHAnsi" w:cstheme="minorHAnsi"/>
@@ -12266,7 +13270,25 @@
           <w:sz w:val="22"/>
           <w:szCs w:val="22"/>
         </w:rPr>
-        <w:t>VNN: { anno, nota }</w:t>
+        <w:t xml:space="preserve">VNN: { </w:t>
+      </w:r>
+      <w:proofErr w:type="spellStart"/>
+      <w:r>
+        <w:rPr>
+          <w:rFonts w:asciiTheme="minorHAnsi" w:hAnsiTheme="minorHAnsi" w:cstheme="minorHAnsi"/>
+          <w:sz w:val="22"/>
+          <w:szCs w:val="22"/>
+        </w:rPr>
+        <w:t>anno</w:t>
+      </w:r>
+      <w:proofErr w:type="spellEnd"/>
+      <w:r>
+        <w:rPr>
+          <w:rFonts w:asciiTheme="minorHAnsi" w:hAnsiTheme="minorHAnsi" w:cstheme="minorHAnsi"/>
+          <w:sz w:val="22"/>
+          <w:szCs w:val="22"/>
+        </w:rPr>
+        <w:t>, nota }</w:t>
       </w:r>
     </w:p>
     <w:p>
@@ -12299,13 +13321,59 @@
         </w:rPr>
         <w:t xml:space="preserve"> </w:t>
       </w:r>
-      <w:r>
-        <w:rPr>
-          <w:rFonts w:asciiTheme="minorHAnsi" w:hAnsiTheme="minorHAnsi" w:cstheme="minorHAnsi"/>
-          <w:sz w:val="22"/>
-          <w:szCs w:val="22"/>
-        </w:rPr>
-        <w:t>cif_empresa } references EMPRESA (cif)</w:t>
+      <w:proofErr w:type="spellStart"/>
+      <w:r>
+        <w:rPr>
+          <w:rFonts w:asciiTheme="minorHAnsi" w:hAnsiTheme="minorHAnsi" w:cstheme="minorHAnsi"/>
+          <w:sz w:val="22"/>
+          <w:szCs w:val="22"/>
+        </w:rPr>
+        <w:t>cif_empresa</w:t>
+      </w:r>
+      <w:proofErr w:type="spellEnd"/>
+      <w:r>
+        <w:rPr>
+          <w:rFonts w:asciiTheme="minorHAnsi" w:hAnsiTheme="minorHAnsi" w:cstheme="minorHAnsi"/>
+          <w:sz w:val="22"/>
+          <w:szCs w:val="22"/>
+        </w:rPr>
+        <w:t xml:space="preserve"> } </w:t>
+      </w:r>
+      <w:proofErr w:type="spellStart"/>
+      <w:r>
+        <w:rPr>
+          <w:rFonts w:asciiTheme="minorHAnsi" w:hAnsiTheme="minorHAnsi" w:cstheme="minorHAnsi"/>
+          <w:sz w:val="22"/>
+          <w:szCs w:val="22"/>
+        </w:rPr>
+        <w:t>references</w:t>
+      </w:r>
+      <w:proofErr w:type="spellEnd"/>
+      <w:r>
+        <w:rPr>
+          <w:rFonts w:asciiTheme="minorHAnsi" w:hAnsiTheme="minorHAnsi" w:cstheme="minorHAnsi"/>
+          <w:sz w:val="22"/>
+          <w:szCs w:val="22"/>
+        </w:rPr>
+        <w:t xml:space="preserve"> EMPRESA (</w:t>
+      </w:r>
+      <w:proofErr w:type="spellStart"/>
+      <w:r>
+        <w:rPr>
+          <w:rFonts w:asciiTheme="minorHAnsi" w:hAnsiTheme="minorHAnsi" w:cstheme="minorHAnsi"/>
+          <w:sz w:val="22"/>
+          <w:szCs w:val="22"/>
+        </w:rPr>
+        <w:t>cif</w:t>
+      </w:r>
+      <w:proofErr w:type="spellEnd"/>
+      <w:r>
+        <w:rPr>
+          <w:rFonts w:asciiTheme="minorHAnsi" w:hAnsiTheme="minorHAnsi" w:cstheme="minorHAnsi"/>
+          <w:sz w:val="22"/>
+          <w:szCs w:val="22"/>
+        </w:rPr>
+        <w:t>)</w:t>
       </w:r>
     </w:p>
     <w:p>
@@ -12338,21 +13406,59 @@
         </w:rPr>
         <w:t xml:space="preserve"> </w:t>
       </w:r>
-      <w:r>
-        <w:rPr>
-          <w:rFonts w:asciiTheme="minorHAnsi" w:hAnsiTheme="minorHAnsi" w:cstheme="minorHAnsi"/>
-          <w:sz w:val="22"/>
-          <w:szCs w:val="22"/>
-        </w:rPr>
-        <w:t xml:space="preserve">cod_actividad } </w:t>
-      </w:r>
-      <w:r>
-        <w:rPr>
-          <w:rFonts w:asciiTheme="minorHAnsi" w:hAnsiTheme="minorHAnsi" w:cstheme="minorHAnsi"/>
-          <w:sz w:val="22"/>
-          <w:szCs w:val="22"/>
-        </w:rPr>
-        <w:t>references ACTIVIDAD_LABORAL (cod_actividad)</w:t>
+      <w:proofErr w:type="spellStart"/>
+      <w:r>
+        <w:rPr>
+          <w:rFonts w:asciiTheme="minorHAnsi" w:hAnsiTheme="minorHAnsi" w:cstheme="minorHAnsi"/>
+          <w:sz w:val="22"/>
+          <w:szCs w:val="22"/>
+        </w:rPr>
+        <w:t>cod_actividad</w:t>
+      </w:r>
+      <w:proofErr w:type="spellEnd"/>
+      <w:r>
+        <w:rPr>
+          <w:rFonts w:asciiTheme="minorHAnsi" w:hAnsiTheme="minorHAnsi" w:cstheme="minorHAnsi"/>
+          <w:sz w:val="22"/>
+          <w:szCs w:val="22"/>
+        </w:rPr>
+        <w:t xml:space="preserve"> } </w:t>
+      </w:r>
+      <w:proofErr w:type="spellStart"/>
+      <w:r>
+        <w:rPr>
+          <w:rFonts w:asciiTheme="minorHAnsi" w:hAnsiTheme="minorHAnsi" w:cstheme="minorHAnsi"/>
+          <w:sz w:val="22"/>
+          <w:szCs w:val="22"/>
+        </w:rPr>
+        <w:t>references</w:t>
+      </w:r>
+      <w:proofErr w:type="spellEnd"/>
+      <w:r>
+        <w:rPr>
+          <w:rFonts w:asciiTheme="minorHAnsi" w:hAnsiTheme="minorHAnsi" w:cstheme="minorHAnsi"/>
+          <w:sz w:val="22"/>
+          <w:szCs w:val="22"/>
+        </w:rPr>
+        <w:t xml:space="preserve"> ACTIVIDAD_LABORAL (</w:t>
+      </w:r>
+      <w:proofErr w:type="spellStart"/>
+      <w:r>
+        <w:rPr>
+          <w:rFonts w:asciiTheme="minorHAnsi" w:hAnsiTheme="minorHAnsi" w:cstheme="minorHAnsi"/>
+          <w:sz w:val="22"/>
+          <w:szCs w:val="22"/>
+        </w:rPr>
+        <w:t>cod_actividad</w:t>
+      </w:r>
+      <w:proofErr w:type="spellEnd"/>
+      <w:r>
+        <w:rPr>
+          <w:rFonts w:asciiTheme="minorHAnsi" w:hAnsiTheme="minorHAnsi" w:cstheme="minorHAnsi"/>
+          <w:sz w:val="22"/>
+          <w:szCs w:val="22"/>
+        </w:rPr>
+        <w:t>)</w:t>
       </w:r>
     </w:p>
     <w:p>
@@ -12410,6 +13516,7 @@
         </w:rPr>
         <w:t xml:space="preserve"> </w:t>
       </w:r>
+      <w:proofErr w:type="spellStart"/>
       <w:r>
         <w:rPr>
           <w:rFonts w:asciiTheme="minorHAnsi" w:hAnsiTheme="minorHAnsi" w:cstheme="minorHAnsi"/>
@@ -12421,6 +13528,7 @@
         </w:rPr>
         <w:t>cod_titulacion</w:t>
       </w:r>
+      <w:proofErr w:type="spellEnd"/>
       <w:r>
         <w:rPr>
           <w:rFonts w:asciiTheme="minorHAnsi" w:hAnsiTheme="minorHAnsi" w:cstheme="minorHAnsi"/>
@@ -12429,6 +13537,7 @@
         </w:rPr>
         <w:t xml:space="preserve">, </w:t>
       </w:r>
+      <w:proofErr w:type="spellStart"/>
       <w:r>
         <w:rPr>
           <w:rFonts w:asciiTheme="minorHAnsi" w:hAnsiTheme="minorHAnsi" w:cstheme="minorHAnsi"/>
@@ -12440,6 +13549,7 @@
         </w:rPr>
         <w:t>cod_centro</w:t>
       </w:r>
+      <w:proofErr w:type="spellEnd"/>
       <w:r>
         <w:rPr>
           <w:rFonts w:asciiTheme="minorHAnsi" w:hAnsiTheme="minorHAnsi" w:cstheme="minorHAnsi"/>
@@ -12459,6 +13569,7 @@
         </w:rPr>
         <w:t xml:space="preserve"> </w:t>
       </w:r>
+      <w:proofErr w:type="spellStart"/>
       <w:r>
         <w:rPr>
           <w:rFonts w:asciiTheme="minorHAnsi" w:hAnsiTheme="minorHAnsi" w:cstheme="minorHAnsi"/>
@@ -12470,6 +13581,7 @@
         </w:rPr>
         <w:t>dni_alumno</w:t>
       </w:r>
+      <w:proofErr w:type="spellEnd"/>
       <w:r>
         <w:rPr>
           <w:rFonts w:asciiTheme="minorHAnsi" w:hAnsiTheme="minorHAnsi" w:cstheme="minorHAnsi"/>
@@ -12487,7 +13599,25 @@
           <w:sz w:val="22"/>
           <w:szCs w:val="22"/>
         </w:rPr>
-        <w:t xml:space="preserve"> anno, nota</w:t>
+        <w:t xml:space="preserve"> </w:t>
+      </w:r>
+      <w:proofErr w:type="spellStart"/>
+      <w:r>
+        <w:rPr>
+          <w:rFonts w:asciiTheme="minorHAnsi" w:hAnsiTheme="minorHAnsi" w:cstheme="minorHAnsi"/>
+          <w:sz w:val="22"/>
+          <w:szCs w:val="22"/>
+        </w:rPr>
+        <w:t>anno</w:t>
+      </w:r>
+      <w:proofErr w:type="spellEnd"/>
+      <w:r>
+        <w:rPr>
+          <w:rFonts w:asciiTheme="minorHAnsi" w:hAnsiTheme="minorHAnsi" w:cstheme="minorHAnsi"/>
+          <w:sz w:val="22"/>
+          <w:szCs w:val="22"/>
+        </w:rPr>
+        <w:t>, nota</w:t>
       </w:r>
       <w:r>
         <w:rPr>
@@ -12550,6 +13680,7 @@
         </w:rPr>
         <w:t xml:space="preserve"> </w:t>
       </w:r>
+      <w:proofErr w:type="spellStart"/>
       <w:r>
         <w:rPr>
           <w:rFonts w:asciiTheme="minorHAnsi" w:hAnsiTheme="minorHAnsi" w:cstheme="minorHAnsi"/>
@@ -12561,6 +13692,7 @@
         </w:rPr>
         <w:t>cod_titulacion</w:t>
       </w:r>
+      <w:proofErr w:type="spellEnd"/>
       <w:r>
         <w:rPr>
           <w:rFonts w:asciiTheme="minorHAnsi" w:hAnsiTheme="minorHAnsi" w:cstheme="minorHAnsi"/>
@@ -12569,6 +13701,7 @@
         </w:rPr>
         <w:t xml:space="preserve">, </w:t>
       </w:r>
+      <w:proofErr w:type="spellStart"/>
       <w:r>
         <w:rPr>
           <w:rFonts w:asciiTheme="minorHAnsi" w:hAnsiTheme="minorHAnsi" w:cstheme="minorHAnsi"/>
@@ -12580,6 +13713,7 @@
         </w:rPr>
         <w:t>cod_centro</w:t>
       </w:r>
+      <w:proofErr w:type="spellEnd"/>
       <w:r>
         <w:rPr>
           <w:rFonts w:asciiTheme="minorHAnsi" w:hAnsiTheme="minorHAnsi" w:cstheme="minorHAnsi"/>
@@ -12597,6 +13731,7 @@
         </w:rPr>
         <w:t xml:space="preserve"> </w:t>
       </w:r>
+      <w:proofErr w:type="spellStart"/>
       <w:r>
         <w:rPr>
           <w:rFonts w:asciiTheme="minorHAnsi" w:hAnsiTheme="minorHAnsi" w:cstheme="minorHAnsi"/>
@@ -12608,6 +13743,7 @@
         </w:rPr>
         <w:t>dni_alumno</w:t>
       </w:r>
+      <w:proofErr w:type="spellEnd"/>
       <w:r>
         <w:rPr>
           <w:rFonts w:asciiTheme="minorHAnsi" w:hAnsiTheme="minorHAnsi" w:cstheme="minorHAnsi"/>
@@ -12658,7 +13794,25 @@
           <w:sz w:val="22"/>
           <w:szCs w:val="22"/>
         </w:rPr>
-        <w:t>{anno, nota}</w:t>
+        <w:t>{</w:t>
+      </w:r>
+      <w:proofErr w:type="spellStart"/>
+      <w:r>
+        <w:rPr>
+          <w:rFonts w:asciiTheme="minorHAnsi" w:hAnsiTheme="minorHAnsi" w:cstheme="minorHAnsi"/>
+          <w:sz w:val="22"/>
+          <w:szCs w:val="22"/>
+        </w:rPr>
+        <w:t>anno</w:t>
+      </w:r>
+      <w:proofErr w:type="spellEnd"/>
+      <w:r>
+        <w:rPr>
+          <w:rFonts w:asciiTheme="minorHAnsi" w:hAnsiTheme="minorHAnsi" w:cstheme="minorHAnsi"/>
+          <w:sz w:val="22"/>
+          <w:szCs w:val="22"/>
+        </w:rPr>
+        <w:t>, nota}</w:t>
       </w:r>
     </w:p>
     <w:p>
@@ -12707,6 +13861,7 @@
         </w:rPr>
         <w:t xml:space="preserve"> </w:t>
       </w:r>
+      <w:proofErr w:type="spellStart"/>
       <w:r>
         <w:rPr>
           <w:rFonts w:asciiTheme="minorHAnsi" w:hAnsiTheme="minorHAnsi" w:cstheme="minorHAnsi"/>
@@ -12716,13 +13871,50 @@
         </w:rPr>
         <w:t>cod_titulacion</w:t>
       </w:r>
-      <w:r>
-        <w:rPr>
-          <w:rFonts w:asciiTheme="minorHAnsi" w:hAnsiTheme="minorHAnsi" w:cstheme="minorHAnsi"/>
-          <w:sz w:val="22"/>
-          <w:szCs w:val="22"/>
-        </w:rPr>
-        <w:t xml:space="preserve"> } references TITULACION (cod_titulacion)</w:t>
+      <w:proofErr w:type="spellEnd"/>
+      <w:r>
+        <w:rPr>
+          <w:rFonts w:asciiTheme="minorHAnsi" w:hAnsiTheme="minorHAnsi" w:cstheme="minorHAnsi"/>
+          <w:sz w:val="22"/>
+          <w:szCs w:val="22"/>
+        </w:rPr>
+        <w:t xml:space="preserve"> } </w:t>
+      </w:r>
+      <w:proofErr w:type="spellStart"/>
+      <w:r>
+        <w:rPr>
+          <w:rFonts w:asciiTheme="minorHAnsi" w:hAnsiTheme="minorHAnsi" w:cstheme="minorHAnsi"/>
+          <w:sz w:val="22"/>
+          <w:szCs w:val="22"/>
+        </w:rPr>
+        <w:t>references</w:t>
+      </w:r>
+      <w:proofErr w:type="spellEnd"/>
+      <w:r>
+        <w:rPr>
+          <w:rFonts w:asciiTheme="minorHAnsi" w:hAnsiTheme="minorHAnsi" w:cstheme="minorHAnsi"/>
+          <w:sz w:val="22"/>
+          <w:szCs w:val="22"/>
+        </w:rPr>
+        <w:t xml:space="preserve"> TITULACION (</w:t>
+      </w:r>
+      <w:proofErr w:type="spellStart"/>
+      <w:r>
+        <w:rPr>
+          <w:rFonts w:asciiTheme="minorHAnsi" w:hAnsiTheme="minorHAnsi" w:cstheme="minorHAnsi"/>
+          <w:sz w:val="22"/>
+          <w:szCs w:val="22"/>
+        </w:rPr>
+        <w:t>cod_titulacion</w:t>
+      </w:r>
+      <w:proofErr w:type="spellEnd"/>
+      <w:r>
+        <w:rPr>
+          <w:rFonts w:asciiTheme="minorHAnsi" w:hAnsiTheme="minorHAnsi" w:cstheme="minorHAnsi"/>
+          <w:sz w:val="22"/>
+          <w:szCs w:val="22"/>
+        </w:rPr>
+        <w:t>)</w:t>
       </w:r>
     </w:p>
     <w:p>
@@ -12771,6 +13963,7 @@
         </w:rPr>
         <w:t xml:space="preserve"> </w:t>
       </w:r>
+      <w:proofErr w:type="spellStart"/>
       <w:r>
         <w:rPr>
           <w:rFonts w:asciiTheme="minorHAnsi" w:hAnsiTheme="minorHAnsi" w:cstheme="minorHAnsi"/>
@@ -12789,13 +13982,50 @@
         </w:rPr>
         <w:t>centro</w:t>
       </w:r>
-      <w:r>
-        <w:rPr>
-          <w:rFonts w:asciiTheme="minorHAnsi" w:hAnsiTheme="minorHAnsi" w:cstheme="minorHAnsi"/>
-          <w:sz w:val="22"/>
-          <w:szCs w:val="22"/>
-        </w:rPr>
-        <w:t xml:space="preserve"> } references CENTRO (cod_centro)</w:t>
+      <w:proofErr w:type="spellEnd"/>
+      <w:r>
+        <w:rPr>
+          <w:rFonts w:asciiTheme="minorHAnsi" w:hAnsiTheme="minorHAnsi" w:cstheme="minorHAnsi"/>
+          <w:sz w:val="22"/>
+          <w:szCs w:val="22"/>
+        </w:rPr>
+        <w:t xml:space="preserve"> } </w:t>
+      </w:r>
+      <w:proofErr w:type="spellStart"/>
+      <w:r>
+        <w:rPr>
+          <w:rFonts w:asciiTheme="minorHAnsi" w:hAnsiTheme="minorHAnsi" w:cstheme="minorHAnsi"/>
+          <w:sz w:val="22"/>
+          <w:szCs w:val="22"/>
+        </w:rPr>
+        <w:t>references</w:t>
+      </w:r>
+      <w:proofErr w:type="spellEnd"/>
+      <w:r>
+        <w:rPr>
+          <w:rFonts w:asciiTheme="minorHAnsi" w:hAnsiTheme="minorHAnsi" w:cstheme="minorHAnsi"/>
+          <w:sz w:val="22"/>
+          <w:szCs w:val="22"/>
+        </w:rPr>
+        <w:t xml:space="preserve"> CENTRO (</w:t>
+      </w:r>
+      <w:proofErr w:type="spellStart"/>
+      <w:r>
+        <w:rPr>
+          <w:rFonts w:asciiTheme="minorHAnsi" w:hAnsiTheme="minorHAnsi" w:cstheme="minorHAnsi"/>
+          <w:sz w:val="22"/>
+          <w:szCs w:val="22"/>
+        </w:rPr>
+        <w:t>cod_centro</w:t>
+      </w:r>
+      <w:proofErr w:type="spellEnd"/>
+      <w:r>
+        <w:rPr>
+          <w:rFonts w:asciiTheme="minorHAnsi" w:hAnsiTheme="minorHAnsi" w:cstheme="minorHAnsi"/>
+          <w:sz w:val="22"/>
+          <w:szCs w:val="22"/>
+        </w:rPr>
+        <w:t>)</w:t>
       </w:r>
     </w:p>
     <w:p>
@@ -12844,6 +14074,7 @@
         </w:rPr>
         <w:t xml:space="preserve"> </w:t>
       </w:r>
+      <w:proofErr w:type="spellStart"/>
       <w:r>
         <w:rPr>
           <w:rFonts w:asciiTheme="minorHAnsi" w:hAnsiTheme="minorHAnsi" w:cstheme="minorHAnsi"/>
@@ -12853,13 +14084,50 @@
         </w:rPr>
         <w:t>dni_alumno</w:t>
       </w:r>
-      <w:r>
-        <w:rPr>
-          <w:rFonts w:asciiTheme="minorHAnsi" w:hAnsiTheme="minorHAnsi" w:cstheme="minorHAnsi"/>
-          <w:sz w:val="22"/>
-          <w:szCs w:val="22"/>
-        </w:rPr>
-        <w:t xml:space="preserve"> } references ALUMNO (dni)</w:t>
+      <w:proofErr w:type="spellEnd"/>
+      <w:r>
+        <w:rPr>
+          <w:rFonts w:asciiTheme="minorHAnsi" w:hAnsiTheme="minorHAnsi" w:cstheme="minorHAnsi"/>
+          <w:sz w:val="22"/>
+          <w:szCs w:val="22"/>
+        </w:rPr>
+        <w:t xml:space="preserve"> } </w:t>
+      </w:r>
+      <w:proofErr w:type="spellStart"/>
+      <w:r>
+        <w:rPr>
+          <w:rFonts w:asciiTheme="minorHAnsi" w:hAnsiTheme="minorHAnsi" w:cstheme="minorHAnsi"/>
+          <w:sz w:val="22"/>
+          <w:szCs w:val="22"/>
+        </w:rPr>
+        <w:t>references</w:t>
+      </w:r>
+      <w:proofErr w:type="spellEnd"/>
+      <w:r>
+        <w:rPr>
+          <w:rFonts w:asciiTheme="minorHAnsi" w:hAnsiTheme="minorHAnsi" w:cstheme="minorHAnsi"/>
+          <w:sz w:val="22"/>
+          <w:szCs w:val="22"/>
+        </w:rPr>
+        <w:t xml:space="preserve"> ALUMNO (</w:t>
+      </w:r>
+      <w:proofErr w:type="spellStart"/>
+      <w:r>
+        <w:rPr>
+          <w:rFonts w:asciiTheme="minorHAnsi" w:hAnsiTheme="minorHAnsi" w:cstheme="minorHAnsi"/>
+          <w:sz w:val="22"/>
+          <w:szCs w:val="22"/>
+        </w:rPr>
+        <w:t>dni</w:t>
+      </w:r>
+      <w:proofErr w:type="spellEnd"/>
+      <w:r>
+        <w:rPr>
+          <w:rFonts w:asciiTheme="minorHAnsi" w:hAnsiTheme="minorHAnsi" w:cstheme="minorHAnsi"/>
+          <w:sz w:val="22"/>
+          <w:szCs w:val="22"/>
+        </w:rPr>
+        <w:t>)</w:t>
       </w:r>
     </w:p>
     <w:p>
@@ -12911,6 +14179,7 @@
         </w:rPr>
         <w:t xml:space="preserve"> ( </w:t>
       </w:r>
+      <w:proofErr w:type="spellStart"/>
       <w:r>
         <w:rPr>
           <w:rFonts w:asciiTheme="minorHAnsi" w:hAnsiTheme="minorHAnsi" w:cstheme="minorHAnsi"/>
@@ -12922,6 +14191,7 @@
         </w:rPr>
         <w:t>dni_alumno</w:t>
       </w:r>
+      <w:proofErr w:type="spellEnd"/>
       <w:r>
         <w:rPr>
           <w:rFonts w:asciiTheme="minorHAnsi" w:hAnsiTheme="minorHAnsi" w:cstheme="minorHAnsi"/>
@@ -12941,8 +14211,9 @@
           <w:szCs w:val="22"/>
           <w:u w:val="single"/>
         </w:rPr>
-        <w:t xml:space="preserve"> cif_empresa</w:t>
-      </w:r>
+        <w:t xml:space="preserve"> </w:t>
+      </w:r>
+      <w:proofErr w:type="spellStart"/>
       <w:r>
         <w:rPr>
           <w:rFonts w:asciiTheme="minorHAnsi" w:hAnsiTheme="minorHAnsi" w:cstheme="minorHAnsi"/>
@@ -12950,9 +14221,11 @@
           <w:bCs/>
           <w:sz w:val="22"/>
           <w:szCs w:val="22"/>
-        </w:rPr>
-        <w:t>,</w:t>
-      </w:r>
+          <w:u w:val="single"/>
+        </w:rPr>
+        <w:t>cif_empresa</w:t>
+      </w:r>
+      <w:proofErr w:type="spellEnd"/>
       <w:r>
         <w:rPr>
           <w:rFonts w:asciiTheme="minorHAnsi" w:hAnsiTheme="minorHAnsi" w:cstheme="minorHAnsi"/>
@@ -12960,9 +14233,8 @@
           <w:bCs/>
           <w:sz w:val="22"/>
           <w:szCs w:val="22"/>
-          <w:u w:val="single"/>
-        </w:rPr>
-        <w:t xml:space="preserve"> fecha_ini</w:t>
+        </w:rPr>
+        <w:t>,</w:t>
       </w:r>
       <w:r>
         <w:rPr>
@@ -12971,6 +14243,30 @@
           <w:bCs/>
           <w:sz w:val="22"/>
           <w:szCs w:val="22"/>
+          <w:u w:val="single"/>
+        </w:rPr>
+        <w:t xml:space="preserve"> </w:t>
+      </w:r>
+      <w:proofErr w:type="spellStart"/>
+      <w:r>
+        <w:rPr>
+          <w:rFonts w:asciiTheme="minorHAnsi" w:hAnsiTheme="minorHAnsi" w:cstheme="minorHAnsi"/>
+          <w:b/>
+          <w:bCs/>
+          <w:sz w:val="22"/>
+          <w:szCs w:val="22"/>
+          <w:u w:val="single"/>
+        </w:rPr>
+        <w:t>fecha_ini</w:t>
+      </w:r>
+      <w:proofErr w:type="spellEnd"/>
+      <w:r>
+        <w:rPr>
+          <w:rFonts w:asciiTheme="minorHAnsi" w:hAnsiTheme="minorHAnsi" w:cstheme="minorHAnsi"/>
+          <w:b/>
+          <w:bCs/>
+          <w:sz w:val="22"/>
+          <w:szCs w:val="22"/>
         </w:rPr>
         <w:t>,</w:t>
       </w:r>
@@ -12980,7 +14276,43 @@
           <w:sz w:val="22"/>
           <w:szCs w:val="22"/>
         </w:rPr>
-        <w:t xml:space="preserve"> cod_actividad, fecha_fin )</w:t>
+        <w:t xml:space="preserve"> </w:t>
+      </w:r>
+      <w:proofErr w:type="spellStart"/>
+      <w:r>
+        <w:rPr>
+          <w:rFonts w:asciiTheme="minorHAnsi" w:hAnsiTheme="minorHAnsi" w:cstheme="minorHAnsi"/>
+          <w:sz w:val="22"/>
+          <w:szCs w:val="22"/>
+        </w:rPr>
+        <w:t>cod_actividad</w:t>
+      </w:r>
+      <w:proofErr w:type="spellEnd"/>
+      <w:r>
+        <w:rPr>
+          <w:rFonts w:asciiTheme="minorHAnsi" w:hAnsiTheme="minorHAnsi" w:cstheme="minorHAnsi"/>
+          <w:sz w:val="22"/>
+          <w:szCs w:val="22"/>
+        </w:rPr>
+        <w:t xml:space="preserve">, </w:t>
+      </w:r>
+      <w:proofErr w:type="spellStart"/>
+      <w:r>
+        <w:rPr>
+          <w:rFonts w:asciiTheme="minorHAnsi" w:hAnsiTheme="minorHAnsi" w:cstheme="minorHAnsi"/>
+          <w:sz w:val="22"/>
+          <w:szCs w:val="22"/>
+        </w:rPr>
+        <w:t>fecha_fin</w:t>
+      </w:r>
+      <w:proofErr w:type="spellEnd"/>
+      <w:r>
+        <w:rPr>
+          <w:rFonts w:asciiTheme="minorHAnsi" w:hAnsiTheme="minorHAnsi" w:cstheme="minorHAnsi"/>
+          <w:sz w:val="22"/>
+          <w:szCs w:val="22"/>
+        </w:rPr>
+        <w:t xml:space="preserve"> )</w:t>
       </w:r>
     </w:p>
     <w:p>
@@ -13011,6 +14343,7 @@
         </w:rPr>
         <w:t xml:space="preserve"> </w:t>
       </w:r>
+      <w:proofErr w:type="spellStart"/>
       <w:r>
         <w:rPr>
           <w:rFonts w:asciiTheme="minorHAnsi" w:hAnsiTheme="minorHAnsi" w:cstheme="minorHAnsi"/>
@@ -13022,6 +14355,7 @@
         </w:rPr>
         <w:t>dni_alumno</w:t>
       </w:r>
+      <w:proofErr w:type="spellEnd"/>
       <w:r>
         <w:rPr>
           <w:rFonts w:asciiTheme="minorHAnsi" w:hAnsiTheme="minorHAnsi" w:cstheme="minorHAnsi"/>
@@ -13041,8 +14375,9 @@
           <w:szCs w:val="22"/>
           <w:u w:val="single"/>
         </w:rPr>
-        <w:t xml:space="preserve"> cif_empresa</w:t>
-      </w:r>
+        <w:t xml:space="preserve"> </w:t>
+      </w:r>
+      <w:proofErr w:type="spellStart"/>
       <w:r>
         <w:rPr>
           <w:rFonts w:asciiTheme="minorHAnsi" w:hAnsiTheme="minorHAnsi" w:cstheme="minorHAnsi"/>
@@ -13050,9 +14385,11 @@
           <w:bCs/>
           <w:sz w:val="22"/>
           <w:szCs w:val="22"/>
-        </w:rPr>
-        <w:t>,</w:t>
-      </w:r>
+          <w:u w:val="single"/>
+        </w:rPr>
+        <w:t>cif_empresa</w:t>
+      </w:r>
+      <w:proofErr w:type="spellEnd"/>
       <w:r>
         <w:rPr>
           <w:rFonts w:asciiTheme="minorHAnsi" w:hAnsiTheme="minorHAnsi" w:cstheme="minorHAnsi"/>
@@ -13060,10 +14397,33 @@
           <w:bCs/>
           <w:sz w:val="22"/>
           <w:szCs w:val="22"/>
+        </w:rPr>
+        <w:t>,</w:t>
+      </w:r>
+      <w:r>
+        <w:rPr>
+          <w:rFonts w:asciiTheme="minorHAnsi" w:hAnsiTheme="minorHAnsi" w:cstheme="minorHAnsi"/>
+          <w:b/>
+          <w:bCs/>
+          <w:sz w:val="22"/>
+          <w:szCs w:val="22"/>
           <w:u w:val="single"/>
         </w:rPr>
-        <w:t xml:space="preserve"> fecha_ini</w:t>
-      </w:r>
+        <w:t xml:space="preserve"> </w:t>
+      </w:r>
+      <w:proofErr w:type="spellStart"/>
+      <w:r>
+        <w:rPr>
+          <w:rFonts w:asciiTheme="minorHAnsi" w:hAnsiTheme="minorHAnsi" w:cstheme="minorHAnsi"/>
+          <w:b/>
+          <w:bCs/>
+          <w:sz w:val="22"/>
+          <w:szCs w:val="22"/>
+          <w:u w:val="single"/>
+        </w:rPr>
+        <w:t>fecha_ini</w:t>
+      </w:r>
+      <w:proofErr w:type="spellEnd"/>
       <w:r>
         <w:rPr>
           <w:rFonts w:asciiTheme="minorHAnsi" w:hAnsiTheme="minorHAnsi" w:cstheme="minorHAnsi"/>
@@ -13090,7 +14450,43 @@
           <w:sz w:val="22"/>
           <w:szCs w:val="22"/>
         </w:rPr>
-        <w:t>Puede ser null: { fecha_fin }</w:t>
+        <w:t xml:space="preserve">Puede ser </w:t>
+      </w:r>
+      <w:proofErr w:type="spellStart"/>
+      <w:r>
+        <w:rPr>
+          <w:rFonts w:asciiTheme="minorHAnsi" w:hAnsiTheme="minorHAnsi" w:cstheme="minorHAnsi"/>
+          <w:sz w:val="22"/>
+          <w:szCs w:val="22"/>
+        </w:rPr>
+        <w:t>null</w:t>
+      </w:r>
+      <w:proofErr w:type="spellEnd"/>
+      <w:r>
+        <w:rPr>
+          <w:rFonts w:asciiTheme="minorHAnsi" w:hAnsiTheme="minorHAnsi" w:cstheme="minorHAnsi"/>
+          <w:sz w:val="22"/>
+          <w:szCs w:val="22"/>
+        </w:rPr>
+        <w:t xml:space="preserve">: { </w:t>
+      </w:r>
+      <w:proofErr w:type="spellStart"/>
+      <w:r>
+        <w:rPr>
+          <w:rFonts w:asciiTheme="minorHAnsi" w:hAnsiTheme="minorHAnsi" w:cstheme="minorHAnsi"/>
+          <w:sz w:val="22"/>
+          <w:szCs w:val="22"/>
+        </w:rPr>
+        <w:t>fecha_fin</w:t>
+      </w:r>
+      <w:proofErr w:type="spellEnd"/>
+      <w:r>
+        <w:rPr>
+          <w:rFonts w:asciiTheme="minorHAnsi" w:hAnsiTheme="minorHAnsi" w:cstheme="minorHAnsi"/>
+          <w:sz w:val="22"/>
+          <w:szCs w:val="22"/>
+        </w:rPr>
+        <w:t xml:space="preserve"> }</w:t>
       </w:r>
     </w:p>
     <w:p>
@@ -13123,6 +14519,7 @@
         </w:rPr>
         <w:t xml:space="preserve"> </w:t>
       </w:r>
+      <w:proofErr w:type="spellStart"/>
       <w:r>
         <w:rPr>
           <w:rFonts w:asciiTheme="minorHAnsi" w:hAnsiTheme="minorHAnsi" w:cstheme="minorHAnsi"/>
@@ -13132,13 +14529,50 @@
         </w:rPr>
         <w:t>dni_alumno</w:t>
       </w:r>
-      <w:r>
-        <w:rPr>
-          <w:rFonts w:asciiTheme="minorHAnsi" w:hAnsiTheme="minorHAnsi" w:cstheme="minorHAnsi"/>
-          <w:sz w:val="22"/>
-          <w:szCs w:val="22"/>
-        </w:rPr>
-        <w:t xml:space="preserve"> } references ALUMNO (dni)</w:t>
+      <w:proofErr w:type="spellEnd"/>
+      <w:r>
+        <w:rPr>
+          <w:rFonts w:asciiTheme="minorHAnsi" w:hAnsiTheme="minorHAnsi" w:cstheme="minorHAnsi"/>
+          <w:sz w:val="22"/>
+          <w:szCs w:val="22"/>
+        </w:rPr>
+        <w:t xml:space="preserve"> } </w:t>
+      </w:r>
+      <w:proofErr w:type="spellStart"/>
+      <w:r>
+        <w:rPr>
+          <w:rFonts w:asciiTheme="minorHAnsi" w:hAnsiTheme="minorHAnsi" w:cstheme="minorHAnsi"/>
+          <w:sz w:val="22"/>
+          <w:szCs w:val="22"/>
+        </w:rPr>
+        <w:t>references</w:t>
+      </w:r>
+      <w:proofErr w:type="spellEnd"/>
+      <w:r>
+        <w:rPr>
+          <w:rFonts w:asciiTheme="minorHAnsi" w:hAnsiTheme="minorHAnsi" w:cstheme="minorHAnsi"/>
+          <w:sz w:val="22"/>
+          <w:szCs w:val="22"/>
+        </w:rPr>
+        <w:t xml:space="preserve"> ALUMNO (</w:t>
+      </w:r>
+      <w:proofErr w:type="spellStart"/>
+      <w:r>
+        <w:rPr>
+          <w:rFonts w:asciiTheme="minorHAnsi" w:hAnsiTheme="minorHAnsi" w:cstheme="minorHAnsi"/>
+          <w:sz w:val="22"/>
+          <w:szCs w:val="22"/>
+        </w:rPr>
+        <w:t>dni</w:t>
+      </w:r>
+      <w:proofErr w:type="spellEnd"/>
+      <w:r>
+        <w:rPr>
+          <w:rFonts w:asciiTheme="minorHAnsi" w:hAnsiTheme="minorHAnsi" w:cstheme="minorHAnsi"/>
+          <w:sz w:val="22"/>
+          <w:szCs w:val="22"/>
+        </w:rPr>
+        <w:t>)</w:t>
       </w:r>
     </w:p>
     <w:p>
@@ -13171,6 +14605,7 @@
         </w:rPr>
         <w:t xml:space="preserve"> </w:t>
       </w:r>
+      <w:proofErr w:type="spellStart"/>
       <w:r>
         <w:rPr>
           <w:rFonts w:asciiTheme="minorHAnsi" w:hAnsiTheme="minorHAnsi" w:cstheme="minorHAnsi"/>
@@ -13180,13 +14615,50 @@
         </w:rPr>
         <w:t>cif_empresa</w:t>
       </w:r>
-      <w:r>
-        <w:rPr>
-          <w:rFonts w:asciiTheme="minorHAnsi" w:hAnsiTheme="minorHAnsi" w:cstheme="minorHAnsi"/>
-          <w:sz w:val="22"/>
-          <w:szCs w:val="22"/>
-        </w:rPr>
-        <w:t xml:space="preserve"> } references EMPRESA (cif)</w:t>
+      <w:proofErr w:type="spellEnd"/>
+      <w:r>
+        <w:rPr>
+          <w:rFonts w:asciiTheme="minorHAnsi" w:hAnsiTheme="minorHAnsi" w:cstheme="minorHAnsi"/>
+          <w:sz w:val="22"/>
+          <w:szCs w:val="22"/>
+        </w:rPr>
+        <w:t xml:space="preserve"> } </w:t>
+      </w:r>
+      <w:proofErr w:type="spellStart"/>
+      <w:r>
+        <w:rPr>
+          <w:rFonts w:asciiTheme="minorHAnsi" w:hAnsiTheme="minorHAnsi" w:cstheme="minorHAnsi"/>
+          <w:sz w:val="22"/>
+          <w:szCs w:val="22"/>
+        </w:rPr>
+        <w:t>references</w:t>
+      </w:r>
+      <w:proofErr w:type="spellEnd"/>
+      <w:r>
+        <w:rPr>
+          <w:rFonts w:asciiTheme="minorHAnsi" w:hAnsiTheme="minorHAnsi" w:cstheme="minorHAnsi"/>
+          <w:sz w:val="22"/>
+          <w:szCs w:val="22"/>
+        </w:rPr>
+        <w:t xml:space="preserve"> EMPRESA (</w:t>
+      </w:r>
+      <w:proofErr w:type="spellStart"/>
+      <w:r>
+        <w:rPr>
+          <w:rFonts w:asciiTheme="minorHAnsi" w:hAnsiTheme="minorHAnsi" w:cstheme="minorHAnsi"/>
+          <w:sz w:val="22"/>
+          <w:szCs w:val="22"/>
+        </w:rPr>
+        <w:t>cif</w:t>
+      </w:r>
+      <w:proofErr w:type="spellEnd"/>
+      <w:r>
+        <w:rPr>
+          <w:rFonts w:asciiTheme="minorHAnsi" w:hAnsiTheme="minorHAnsi" w:cstheme="minorHAnsi"/>
+          <w:sz w:val="22"/>
+          <w:szCs w:val="22"/>
+        </w:rPr>
+        <w:t>)</w:t>
       </w:r>
     </w:p>
     <w:p>
@@ -13219,21 +14691,59 @@
         </w:rPr>
         <w:t xml:space="preserve"> </w:t>
       </w:r>
-      <w:r>
-        <w:rPr>
-          <w:rFonts w:asciiTheme="minorHAnsi" w:hAnsiTheme="minorHAnsi" w:cstheme="minorHAnsi"/>
-          <w:sz w:val="22"/>
-          <w:szCs w:val="22"/>
-        </w:rPr>
-        <w:t xml:space="preserve">cod_actividad } </w:t>
-      </w:r>
-      <w:r>
-        <w:rPr>
-          <w:rFonts w:asciiTheme="minorHAnsi" w:hAnsiTheme="minorHAnsi" w:cstheme="minorHAnsi"/>
-          <w:sz w:val="22"/>
-          <w:szCs w:val="22"/>
-        </w:rPr>
-        <w:t>references ACTIVIDAD_LABORAL (cod_actividad)</w:t>
+      <w:proofErr w:type="spellStart"/>
+      <w:r>
+        <w:rPr>
+          <w:rFonts w:asciiTheme="minorHAnsi" w:hAnsiTheme="minorHAnsi" w:cstheme="minorHAnsi"/>
+          <w:sz w:val="22"/>
+          <w:szCs w:val="22"/>
+        </w:rPr>
+        <w:t>cod_actividad</w:t>
+      </w:r>
+      <w:proofErr w:type="spellEnd"/>
+      <w:r>
+        <w:rPr>
+          <w:rFonts w:asciiTheme="minorHAnsi" w:hAnsiTheme="minorHAnsi" w:cstheme="minorHAnsi"/>
+          <w:sz w:val="22"/>
+          <w:szCs w:val="22"/>
+        </w:rPr>
+        <w:t xml:space="preserve"> } </w:t>
+      </w:r>
+      <w:proofErr w:type="spellStart"/>
+      <w:r>
+        <w:rPr>
+          <w:rFonts w:asciiTheme="minorHAnsi" w:hAnsiTheme="minorHAnsi" w:cstheme="minorHAnsi"/>
+          <w:sz w:val="22"/>
+          <w:szCs w:val="22"/>
+        </w:rPr>
+        <w:t>references</w:t>
+      </w:r>
+      <w:proofErr w:type="spellEnd"/>
+      <w:r>
+        <w:rPr>
+          <w:rFonts w:asciiTheme="minorHAnsi" w:hAnsiTheme="minorHAnsi" w:cstheme="minorHAnsi"/>
+          <w:sz w:val="22"/>
+          <w:szCs w:val="22"/>
+        </w:rPr>
+        <w:t xml:space="preserve"> ACTIVIDAD_LABORAL (</w:t>
+      </w:r>
+      <w:proofErr w:type="spellStart"/>
+      <w:r>
+        <w:rPr>
+          <w:rFonts w:asciiTheme="minorHAnsi" w:hAnsiTheme="minorHAnsi" w:cstheme="minorHAnsi"/>
+          <w:sz w:val="22"/>
+          <w:szCs w:val="22"/>
+        </w:rPr>
+        <w:t>cod_actividad</w:t>
+      </w:r>
+      <w:proofErr w:type="spellEnd"/>
+      <w:r>
+        <w:rPr>
+          <w:rFonts w:asciiTheme="minorHAnsi" w:hAnsiTheme="minorHAnsi" w:cstheme="minorHAnsi"/>
+          <w:sz w:val="22"/>
+          <w:szCs w:val="22"/>
+        </w:rPr>
+        <w:t>)</w:t>
       </w:r>
     </w:p>
     <w:p>
@@ -13275,6 +14785,7 @@
         </w:rPr>
         <w:t xml:space="preserve"> ( </w:t>
       </w:r>
+      <w:proofErr w:type="spellStart"/>
       <w:r>
         <w:rPr>
           <w:rFonts w:asciiTheme="minorHAnsi" w:hAnsiTheme="minorHAnsi" w:cstheme="minorHAnsi"/>
@@ -13286,6 +14797,7 @@
         </w:rPr>
         <w:t>cif_empresa</w:t>
       </w:r>
+      <w:proofErr w:type="spellEnd"/>
       <w:r>
         <w:rPr>
           <w:rFonts w:asciiTheme="minorHAnsi" w:hAnsiTheme="minorHAnsi" w:cstheme="minorHAnsi"/>
@@ -13307,6 +14819,7 @@
         </w:rPr>
         <w:t xml:space="preserve"> </w:t>
       </w:r>
+      <w:proofErr w:type="spellStart"/>
       <w:r>
         <w:rPr>
           <w:rFonts w:asciiTheme="minorHAnsi" w:hAnsiTheme="minorHAnsi" w:cstheme="minorHAnsi"/>
@@ -13317,6 +14830,7 @@
         </w:rPr>
         <w:t>cod_actividad</w:t>
       </w:r>
+      <w:proofErr w:type="spellEnd"/>
       <w:r>
         <w:rPr>
           <w:rFonts w:asciiTheme="minorHAnsi" w:hAnsiTheme="minorHAnsi" w:cstheme="minorHAnsi"/>
@@ -13354,6 +14868,7 @@
         </w:rPr>
         <w:t xml:space="preserve"> </w:t>
       </w:r>
+      <w:proofErr w:type="spellStart"/>
       <w:r>
         <w:rPr>
           <w:rFonts w:asciiTheme="minorHAnsi" w:hAnsiTheme="minorHAnsi" w:cstheme="minorHAnsi"/>
@@ -13365,6 +14880,7 @@
         </w:rPr>
         <w:t>cif_empresa</w:t>
       </w:r>
+      <w:proofErr w:type="spellEnd"/>
       <w:r>
         <w:rPr>
           <w:rFonts w:asciiTheme="minorHAnsi" w:hAnsiTheme="minorHAnsi" w:cstheme="minorHAnsi"/>
@@ -13386,6 +14902,7 @@
         </w:rPr>
         <w:t xml:space="preserve"> </w:t>
       </w:r>
+      <w:proofErr w:type="spellStart"/>
       <w:r>
         <w:rPr>
           <w:rFonts w:asciiTheme="minorHAnsi" w:hAnsiTheme="minorHAnsi" w:cstheme="minorHAnsi"/>
@@ -13396,6 +14913,7 @@
         </w:rPr>
         <w:t>cod_actividad</w:t>
       </w:r>
+      <w:proofErr w:type="spellEnd"/>
       <w:r>
         <w:rPr>
           <w:rFonts w:asciiTheme="minorHAnsi" w:hAnsiTheme="minorHAnsi" w:cstheme="minorHAnsi"/>
@@ -13435,6 +14953,7 @@
         </w:rPr>
         <w:t xml:space="preserve"> </w:t>
       </w:r>
+      <w:proofErr w:type="spellStart"/>
       <w:r>
         <w:rPr>
           <w:rFonts w:asciiTheme="minorHAnsi" w:hAnsiTheme="minorHAnsi" w:cstheme="minorHAnsi"/>
@@ -13444,13 +14963,50 @@
         </w:rPr>
         <w:t>cif_empresa</w:t>
       </w:r>
-      <w:r>
-        <w:rPr>
-          <w:rFonts w:asciiTheme="minorHAnsi" w:hAnsiTheme="minorHAnsi" w:cstheme="minorHAnsi"/>
-          <w:sz w:val="22"/>
-          <w:szCs w:val="22"/>
-        </w:rPr>
-        <w:t xml:space="preserve"> } references EMPRESA (cif)</w:t>
+      <w:proofErr w:type="spellEnd"/>
+      <w:r>
+        <w:rPr>
+          <w:rFonts w:asciiTheme="minorHAnsi" w:hAnsiTheme="minorHAnsi" w:cstheme="minorHAnsi"/>
+          <w:sz w:val="22"/>
+          <w:szCs w:val="22"/>
+        </w:rPr>
+        <w:t xml:space="preserve"> } </w:t>
+      </w:r>
+      <w:proofErr w:type="spellStart"/>
+      <w:r>
+        <w:rPr>
+          <w:rFonts w:asciiTheme="minorHAnsi" w:hAnsiTheme="minorHAnsi" w:cstheme="minorHAnsi"/>
+          <w:sz w:val="22"/>
+          <w:szCs w:val="22"/>
+        </w:rPr>
+        <w:t>references</w:t>
+      </w:r>
+      <w:proofErr w:type="spellEnd"/>
+      <w:r>
+        <w:rPr>
+          <w:rFonts w:asciiTheme="minorHAnsi" w:hAnsiTheme="minorHAnsi" w:cstheme="minorHAnsi"/>
+          <w:sz w:val="22"/>
+          <w:szCs w:val="22"/>
+        </w:rPr>
+        <w:t xml:space="preserve"> EMPRESA (</w:t>
+      </w:r>
+      <w:proofErr w:type="spellStart"/>
+      <w:r>
+        <w:rPr>
+          <w:rFonts w:asciiTheme="minorHAnsi" w:hAnsiTheme="minorHAnsi" w:cstheme="minorHAnsi"/>
+          <w:sz w:val="22"/>
+          <w:szCs w:val="22"/>
+        </w:rPr>
+        <w:t>cif</w:t>
+      </w:r>
+      <w:proofErr w:type="spellEnd"/>
+      <w:r>
+        <w:rPr>
+          <w:rFonts w:asciiTheme="minorHAnsi" w:hAnsiTheme="minorHAnsi" w:cstheme="minorHAnsi"/>
+          <w:sz w:val="22"/>
+          <w:szCs w:val="22"/>
+        </w:rPr>
+        <w:t>)</w:t>
       </w:r>
     </w:p>
     <w:p>
@@ -13483,21 +15039,59 @@
         </w:rPr>
         <w:t xml:space="preserve"> </w:t>
       </w:r>
-      <w:r>
-        <w:rPr>
-          <w:rFonts w:asciiTheme="minorHAnsi" w:hAnsiTheme="minorHAnsi" w:cstheme="minorHAnsi"/>
-          <w:sz w:val="22"/>
-          <w:szCs w:val="22"/>
-        </w:rPr>
-        <w:t xml:space="preserve">cod_actividad } </w:t>
-      </w:r>
-      <w:r>
-        <w:rPr>
-          <w:rFonts w:asciiTheme="minorHAnsi" w:hAnsiTheme="minorHAnsi" w:cstheme="minorHAnsi"/>
-          <w:sz w:val="22"/>
-          <w:szCs w:val="22"/>
-        </w:rPr>
-        <w:t>references ACTIVIDAD_LABORAL (cod_actividad)</w:t>
+      <w:proofErr w:type="spellStart"/>
+      <w:r>
+        <w:rPr>
+          <w:rFonts w:asciiTheme="minorHAnsi" w:hAnsiTheme="minorHAnsi" w:cstheme="minorHAnsi"/>
+          <w:sz w:val="22"/>
+          <w:szCs w:val="22"/>
+        </w:rPr>
+        <w:t>cod_actividad</w:t>
+      </w:r>
+      <w:proofErr w:type="spellEnd"/>
+      <w:r>
+        <w:rPr>
+          <w:rFonts w:asciiTheme="minorHAnsi" w:hAnsiTheme="minorHAnsi" w:cstheme="minorHAnsi"/>
+          <w:sz w:val="22"/>
+          <w:szCs w:val="22"/>
+        </w:rPr>
+        <w:t xml:space="preserve"> } </w:t>
+      </w:r>
+      <w:proofErr w:type="spellStart"/>
+      <w:r>
+        <w:rPr>
+          <w:rFonts w:asciiTheme="minorHAnsi" w:hAnsiTheme="minorHAnsi" w:cstheme="minorHAnsi"/>
+          <w:sz w:val="22"/>
+          <w:szCs w:val="22"/>
+        </w:rPr>
+        <w:t>references</w:t>
+      </w:r>
+      <w:proofErr w:type="spellEnd"/>
+      <w:r>
+        <w:rPr>
+          <w:rFonts w:asciiTheme="minorHAnsi" w:hAnsiTheme="minorHAnsi" w:cstheme="minorHAnsi"/>
+          <w:sz w:val="22"/>
+          <w:szCs w:val="22"/>
+        </w:rPr>
+        <w:t xml:space="preserve"> ACTIVIDAD_LABORAL (</w:t>
+      </w:r>
+      <w:proofErr w:type="spellStart"/>
+      <w:r>
+        <w:rPr>
+          <w:rFonts w:asciiTheme="minorHAnsi" w:hAnsiTheme="minorHAnsi" w:cstheme="minorHAnsi"/>
+          <w:sz w:val="22"/>
+          <w:szCs w:val="22"/>
+        </w:rPr>
+        <w:t>cod_actividad</w:t>
+      </w:r>
+      <w:proofErr w:type="spellEnd"/>
+      <w:r>
+        <w:rPr>
+          <w:rFonts w:asciiTheme="minorHAnsi" w:hAnsiTheme="minorHAnsi" w:cstheme="minorHAnsi"/>
+          <w:sz w:val="22"/>
+          <w:szCs w:val="22"/>
+        </w:rPr>
+        <w:t>)</w:t>
       </w:r>
     </w:p>
     <w:p>
@@ -13537,6 +15131,7 @@
         </w:rPr>
         <w:t xml:space="preserve"> ( </w:t>
       </w:r>
+      <w:proofErr w:type="spellStart"/>
       <w:r>
         <w:rPr>
           <w:rFonts w:asciiTheme="minorHAnsi" w:hAnsiTheme="minorHAnsi" w:cstheme="minorHAnsi"/>
@@ -13546,7 +15141,19 @@
           <w:szCs w:val="22"/>
           <w:u w:val="single"/>
         </w:rPr>
-        <w:t>cod_postal,</w:t>
+        <w:t>cod_postal</w:t>
+      </w:r>
+      <w:proofErr w:type="spellEnd"/>
+      <w:r>
+        <w:rPr>
+          <w:rFonts w:asciiTheme="minorHAnsi" w:hAnsiTheme="minorHAnsi" w:cstheme="minorHAnsi"/>
+          <w:b/>
+          <w:bCs/>
+          <w:sz w:val="22"/>
+          <w:szCs w:val="22"/>
+          <w:u w:val="single"/>
+        </w:rPr>
+        <w:t>,</w:t>
       </w:r>
       <w:r>
         <w:rPr>
@@ -13556,6 +15163,7 @@
         </w:rPr>
         <w:t xml:space="preserve"> </w:t>
       </w:r>
+      <w:proofErr w:type="spellStart"/>
       <w:r>
         <w:rPr>
           <w:rFonts w:asciiTheme="minorHAnsi" w:hAnsiTheme="minorHAnsi" w:cstheme="minorHAnsi"/>
@@ -13570,7 +15178,16 @@
           <w:sz w:val="22"/>
           <w:szCs w:val="22"/>
         </w:rPr>
-        <w:t>municipio )</w:t>
+        <w:t>municipio</w:t>
+      </w:r>
+      <w:proofErr w:type="spellEnd"/>
+      <w:r>
+        <w:rPr>
+          <w:rFonts w:asciiTheme="minorHAnsi" w:hAnsiTheme="minorHAnsi" w:cstheme="minorHAnsi"/>
+          <w:sz w:val="22"/>
+          <w:szCs w:val="22"/>
+        </w:rPr>
+        <w:t xml:space="preserve"> )</w:t>
       </w:r>
     </w:p>
     <w:p>
@@ -13602,6 +15219,7 @@
         </w:rPr>
         <w:t xml:space="preserve"> </w:t>
       </w:r>
+      <w:proofErr w:type="spellStart"/>
       <w:r>
         <w:rPr>
           <w:rFonts w:asciiTheme="minorHAnsi" w:hAnsiTheme="minorHAnsi" w:cstheme="minorHAnsi"/>
@@ -13613,6 +15231,7 @@
         </w:rPr>
         <w:t>cod_postal</w:t>
       </w:r>
+      <w:proofErr w:type="spellEnd"/>
       <w:r>
         <w:rPr>
           <w:rFonts w:asciiTheme="minorHAnsi" w:hAnsiTheme="minorHAnsi" w:cstheme="minorHAnsi"/>
@@ -13652,6 +15271,7 @@
         </w:rPr>
         <w:t xml:space="preserve"> </w:t>
       </w:r>
+      <w:proofErr w:type="spellStart"/>
       <w:r>
         <w:rPr>
           <w:rFonts w:asciiTheme="minorHAnsi" w:hAnsiTheme="minorHAnsi" w:cstheme="minorHAnsi"/>
@@ -13668,14 +15288,34 @@
         </w:rPr>
         <w:t>municipio</w:t>
       </w:r>
-      <w:r>
-        <w:rPr>
-          <w:rFonts w:asciiTheme="minorHAnsi" w:hAnsiTheme="minorHAnsi" w:cstheme="minorHAnsi"/>
-          <w:sz w:val="22"/>
-          <w:szCs w:val="22"/>
-        </w:rPr>
-        <w:t xml:space="preserve"> } references MUNICIPIO (</w:t>
-      </w:r>
+      <w:proofErr w:type="spellEnd"/>
+      <w:r>
+        <w:rPr>
+          <w:rFonts w:asciiTheme="minorHAnsi" w:hAnsiTheme="minorHAnsi" w:cstheme="minorHAnsi"/>
+          <w:sz w:val="22"/>
+          <w:szCs w:val="22"/>
+        </w:rPr>
+        <w:t xml:space="preserve"> } </w:t>
+      </w:r>
+      <w:proofErr w:type="spellStart"/>
+      <w:r>
+        <w:rPr>
+          <w:rFonts w:asciiTheme="minorHAnsi" w:hAnsiTheme="minorHAnsi" w:cstheme="minorHAnsi"/>
+          <w:sz w:val="22"/>
+          <w:szCs w:val="22"/>
+        </w:rPr>
+        <w:t>references</w:t>
+      </w:r>
+      <w:proofErr w:type="spellEnd"/>
+      <w:r>
+        <w:rPr>
+          <w:rFonts w:asciiTheme="minorHAnsi" w:hAnsiTheme="minorHAnsi" w:cstheme="minorHAnsi"/>
+          <w:sz w:val="22"/>
+          <w:szCs w:val="22"/>
+        </w:rPr>
+        <w:t xml:space="preserve"> MUNICIPIO (</w:t>
+      </w:r>
+      <w:proofErr w:type="spellStart"/>
       <w:r>
         <w:rPr>
           <w:rFonts w:asciiTheme="minorHAnsi" w:hAnsiTheme="minorHAnsi" w:cstheme="minorHAnsi"/>
@@ -13690,7 +15330,16 @@
           <w:sz w:val="22"/>
           <w:szCs w:val="22"/>
         </w:rPr>
-        <w:t>municipio)</w:t>
+        <w:t>municipio</w:t>
+      </w:r>
+      <w:proofErr w:type="spellEnd"/>
+      <w:r>
+        <w:rPr>
+          <w:rFonts w:asciiTheme="minorHAnsi" w:hAnsiTheme="minorHAnsi" w:cstheme="minorHAnsi"/>
+          <w:sz w:val="22"/>
+          <w:szCs w:val="22"/>
+        </w:rPr>
+        <w:t>)</w:t>
       </w:r>
     </w:p>
     <w:p>
@@ -13730,6 +15379,7 @@
         </w:rPr>
         <w:t xml:space="preserve"> (</w:t>
       </w:r>
+      <w:proofErr w:type="spellStart"/>
       <w:r>
         <w:rPr>
           <w:rFonts w:asciiTheme="minorHAnsi" w:hAnsiTheme="minorHAnsi" w:cstheme="minorHAnsi"/>
@@ -13739,40 +15389,9 @@
           <w:szCs w:val="22"/>
           <w:u w:val="single"/>
         </w:rPr>
-        <w:t>cod_municipio,</w:t>
-      </w:r>
-      <w:r>
-        <w:rPr>
-          <w:rFonts w:asciiTheme="minorHAnsi" w:hAnsiTheme="minorHAnsi" w:cstheme="minorHAnsi"/>
-          <w:sz w:val="22"/>
-          <w:szCs w:val="22"/>
-        </w:rPr>
-        <w:t xml:space="preserve"> </w:t>
-      </w:r>
-      <w:r>
-        <w:rPr>
-          <w:rFonts w:asciiTheme="minorHAnsi" w:hAnsiTheme="minorHAnsi" w:cstheme="minorHAnsi"/>
-          <w:sz w:val="22"/>
-          <w:szCs w:val="22"/>
-        </w:rPr>
-        <w:t>municipio</w:t>
-      </w:r>
-      <w:r>
-        <w:rPr>
-          <w:rFonts w:asciiTheme="minorHAnsi" w:hAnsiTheme="minorHAnsi" w:cstheme="minorHAnsi"/>
-          <w:sz w:val="22"/>
-          <w:szCs w:val="22"/>
-        </w:rPr>
-        <w:t>_nombre</w:t>
-      </w:r>
-      <w:r>
-        <w:rPr>
-          <w:rFonts w:asciiTheme="minorHAnsi" w:hAnsiTheme="minorHAnsi" w:cstheme="minorHAnsi"/>
-          <w:sz w:val="22"/>
-          <w:szCs w:val="22"/>
-        </w:rPr>
-        <w:t>,</w:t>
-      </w:r>
+        <w:t>cod_municipio</w:t>
+      </w:r>
+      <w:proofErr w:type="spellEnd"/>
       <w:r>
         <w:rPr>
           <w:rFonts w:asciiTheme="minorHAnsi" w:hAnsiTheme="minorHAnsi" w:cstheme="minorHAnsi"/>
@@ -13782,15 +15401,78 @@
           <w:szCs w:val="22"/>
           <w:u w:val="single"/>
         </w:rPr>
+        <w:t>,</w:t>
+      </w:r>
+      <w:r>
+        <w:rPr>
+          <w:rFonts w:asciiTheme="minorHAnsi" w:hAnsiTheme="minorHAnsi" w:cstheme="minorHAnsi"/>
+          <w:sz w:val="22"/>
+          <w:szCs w:val="22"/>
+        </w:rPr>
         <w:t xml:space="preserve"> </w:t>
       </w:r>
-      <w:r>
-        <w:rPr>
-          <w:rFonts w:asciiTheme="minorHAnsi" w:hAnsiTheme="minorHAnsi" w:cstheme="minorHAnsi"/>
-          <w:sz w:val="22"/>
-          <w:szCs w:val="22"/>
-        </w:rPr>
-        <w:t xml:space="preserve"> cod_provincia )</w:t>
+      <w:proofErr w:type="spellStart"/>
+      <w:r>
+        <w:rPr>
+          <w:rFonts w:asciiTheme="minorHAnsi" w:hAnsiTheme="minorHAnsi" w:cstheme="minorHAnsi"/>
+          <w:sz w:val="22"/>
+          <w:szCs w:val="22"/>
+        </w:rPr>
+        <w:t>municipio</w:t>
+      </w:r>
+      <w:r>
+        <w:rPr>
+          <w:rFonts w:asciiTheme="minorHAnsi" w:hAnsiTheme="minorHAnsi" w:cstheme="minorHAnsi"/>
+          <w:sz w:val="22"/>
+          <w:szCs w:val="22"/>
+        </w:rPr>
+        <w:t>_nombre</w:t>
+      </w:r>
+      <w:proofErr w:type="spellEnd"/>
+      <w:r>
+        <w:rPr>
+          <w:rFonts w:asciiTheme="minorHAnsi" w:hAnsiTheme="minorHAnsi" w:cstheme="minorHAnsi"/>
+          <w:sz w:val="22"/>
+          <w:szCs w:val="22"/>
+        </w:rPr>
+        <w:t>,</w:t>
+      </w:r>
+      <w:r>
+        <w:rPr>
+          <w:rFonts w:asciiTheme="minorHAnsi" w:hAnsiTheme="minorHAnsi" w:cstheme="minorHAnsi"/>
+          <w:b/>
+          <w:bCs/>
+          <w:sz w:val="22"/>
+          <w:szCs w:val="22"/>
+          <w:u w:val="single"/>
+        </w:rPr>
+        <w:t xml:space="preserve"> </w:t>
+      </w:r>
+      <w:r>
+        <w:rPr>
+          <w:rFonts w:asciiTheme="minorHAnsi" w:hAnsiTheme="minorHAnsi" w:cstheme="minorHAnsi"/>
+          <w:sz w:val="22"/>
+          <w:szCs w:val="22"/>
+        </w:rPr>
+        <w:t xml:space="preserve"> </w:t>
+      </w:r>
+      <w:proofErr w:type="spellStart"/>
+      <w:r>
+        <w:rPr>
+          <w:rFonts w:asciiTheme="minorHAnsi" w:hAnsiTheme="minorHAnsi" w:cstheme="minorHAnsi"/>
+          <w:sz w:val="22"/>
+          <w:szCs w:val="22"/>
+        </w:rPr>
+        <w:t>cod_provincia</w:t>
+      </w:r>
+      <w:proofErr w:type="spellEnd"/>
+      <w:r>
+        <w:rPr>
+          <w:rFonts w:asciiTheme="minorHAnsi" w:hAnsiTheme="minorHAnsi" w:cstheme="minorHAnsi"/>
+          <w:sz w:val="22"/>
+          <w:szCs w:val="22"/>
+        </w:rPr>
+        <w:t xml:space="preserve"> )</w:t>
       </w:r>
     </w:p>
     <w:p>
@@ -13821,6 +15503,7 @@
         </w:rPr>
         <w:t xml:space="preserve"> </w:t>
       </w:r>
+      <w:proofErr w:type="spellStart"/>
       <w:r>
         <w:rPr>
           <w:rFonts w:asciiTheme="minorHAnsi" w:hAnsiTheme="minorHAnsi" w:cstheme="minorHAnsi"/>
@@ -13843,6 +15526,7 @@
         </w:rPr>
         <w:t>municipio</w:t>
       </w:r>
+      <w:proofErr w:type="spellEnd"/>
       <w:r>
         <w:rPr>
           <w:rFonts w:asciiTheme="minorHAnsi" w:hAnsiTheme="minorHAnsi" w:cstheme="minorHAnsi"/>
@@ -13881,6 +15565,7 @@
         </w:rPr>
         <w:t xml:space="preserve">: { </w:t>
       </w:r>
+      <w:proofErr w:type="spellStart"/>
       <w:r>
         <w:rPr>
           <w:rFonts w:asciiTheme="minorHAnsi" w:hAnsiTheme="minorHAnsi" w:cstheme="minorHAnsi"/>
@@ -13892,6 +15577,7 @@
         </w:rPr>
         <w:t>cod_municipio</w:t>
       </w:r>
+      <w:proofErr w:type="spellEnd"/>
       <w:r>
         <w:rPr>
           <w:rFonts w:asciiTheme="minorHAnsi" w:hAnsiTheme="minorHAnsi" w:cstheme="minorHAnsi"/>
@@ -13920,6 +15606,7 @@
         </w:rPr>
         <w:t xml:space="preserve">VNN: { </w:t>
       </w:r>
+      <w:proofErr w:type="spellStart"/>
       <w:r>
         <w:rPr>
           <w:rFonts w:asciiTheme="minorHAnsi" w:hAnsiTheme="minorHAnsi" w:cstheme="minorHAnsi"/>
@@ -13934,7 +15621,16 @@
           <w:sz w:val="22"/>
           <w:szCs w:val="22"/>
         </w:rPr>
-        <w:t>_nombre }</w:t>
+        <w:t>_nombre</w:t>
+      </w:r>
+      <w:proofErr w:type="spellEnd"/>
+      <w:r>
+        <w:rPr>
+          <w:rFonts w:asciiTheme="minorHAnsi" w:hAnsiTheme="minorHAnsi" w:cstheme="minorHAnsi"/>
+          <w:sz w:val="22"/>
+          <w:szCs w:val="22"/>
+        </w:rPr>
+        <w:t xml:space="preserve"> }</w:t>
       </w:r>
     </w:p>
     <w:p>
@@ -13956,6 +15652,7 @@
         </w:rPr>
         <w:t xml:space="preserve">UNIQUE: { </w:t>
       </w:r>
+      <w:proofErr w:type="spellStart"/>
       <w:r>
         <w:rPr>
           <w:rFonts w:asciiTheme="minorHAnsi" w:hAnsiTheme="minorHAnsi" w:cstheme="minorHAnsi"/>
@@ -13970,7 +15667,16 @@
           <w:sz w:val="22"/>
           <w:szCs w:val="22"/>
         </w:rPr>
-        <w:t>_nombre }</w:t>
+        <w:t>_nombre</w:t>
+      </w:r>
+      <w:proofErr w:type="spellEnd"/>
+      <w:r>
+        <w:rPr>
+          <w:rFonts w:asciiTheme="minorHAnsi" w:hAnsiTheme="minorHAnsi" w:cstheme="minorHAnsi"/>
+          <w:sz w:val="22"/>
+          <w:szCs w:val="22"/>
+        </w:rPr>
+        <w:t xml:space="preserve"> }</w:t>
       </w:r>
     </w:p>
     <w:p>
@@ -13998,7 +15704,16 @@
           <w:sz w:val="22"/>
           <w:szCs w:val="22"/>
         </w:rPr>
-        <w:t xml:space="preserve"> cod_</w:t>
+        <w:t xml:space="preserve"> </w:t>
+      </w:r>
+      <w:proofErr w:type="spellStart"/>
+      <w:r>
+        <w:rPr>
+          <w:rFonts w:asciiTheme="minorHAnsi" w:hAnsiTheme="minorHAnsi" w:cstheme="minorHAnsi"/>
+          <w:sz w:val="22"/>
+          <w:szCs w:val="22"/>
+        </w:rPr>
+        <w:t>cod_</w:t>
       </w:r>
       <w:r>
         <w:rPr>
@@ -14009,13 +15724,50 @@
         </w:rPr>
         <w:t>provincia</w:t>
       </w:r>
-      <w:r>
-        <w:rPr>
-          <w:rFonts w:asciiTheme="minorHAnsi" w:hAnsiTheme="minorHAnsi" w:cstheme="minorHAnsi"/>
-          <w:sz w:val="22"/>
-          <w:szCs w:val="22"/>
-        </w:rPr>
-        <w:t xml:space="preserve"> } references PROVINCIA (cod_provincia)</w:t>
+      <w:proofErr w:type="spellEnd"/>
+      <w:r>
+        <w:rPr>
+          <w:rFonts w:asciiTheme="minorHAnsi" w:hAnsiTheme="minorHAnsi" w:cstheme="minorHAnsi"/>
+          <w:sz w:val="22"/>
+          <w:szCs w:val="22"/>
+        </w:rPr>
+        <w:t xml:space="preserve"> } </w:t>
+      </w:r>
+      <w:proofErr w:type="spellStart"/>
+      <w:r>
+        <w:rPr>
+          <w:rFonts w:asciiTheme="minorHAnsi" w:hAnsiTheme="minorHAnsi" w:cstheme="minorHAnsi"/>
+          <w:sz w:val="22"/>
+          <w:szCs w:val="22"/>
+        </w:rPr>
+        <w:t>references</w:t>
+      </w:r>
+      <w:proofErr w:type="spellEnd"/>
+      <w:r>
+        <w:rPr>
+          <w:rFonts w:asciiTheme="minorHAnsi" w:hAnsiTheme="minorHAnsi" w:cstheme="minorHAnsi"/>
+          <w:sz w:val="22"/>
+          <w:szCs w:val="22"/>
+        </w:rPr>
+        <w:t xml:space="preserve"> PROVINCIA (</w:t>
+      </w:r>
+      <w:proofErr w:type="spellStart"/>
+      <w:r>
+        <w:rPr>
+          <w:rFonts w:asciiTheme="minorHAnsi" w:hAnsiTheme="minorHAnsi" w:cstheme="minorHAnsi"/>
+          <w:sz w:val="22"/>
+          <w:szCs w:val="22"/>
+        </w:rPr>
+        <w:t>cod_provincia</w:t>
+      </w:r>
+      <w:proofErr w:type="spellEnd"/>
+      <w:r>
+        <w:rPr>
+          <w:rFonts w:asciiTheme="minorHAnsi" w:hAnsiTheme="minorHAnsi" w:cstheme="minorHAnsi"/>
+          <w:sz w:val="22"/>
+          <w:szCs w:val="22"/>
+        </w:rPr>
+        <w:t>)</w:t>
       </w:r>
     </w:p>
     <w:p>
@@ -14057,6 +15809,7 @@
         </w:rPr>
         <w:t xml:space="preserve"> (</w:t>
       </w:r>
+      <w:proofErr w:type="spellStart"/>
       <w:r>
         <w:rPr>
           <w:rFonts w:asciiTheme="minorHAnsi" w:hAnsiTheme="minorHAnsi" w:cstheme="minorHAnsi"/>
@@ -14066,15 +15819,45 @@
           <w:szCs w:val="22"/>
           <w:u w:val="single"/>
         </w:rPr>
-        <w:t>cod_provincia,</w:t>
-      </w:r>
-      <w:r>
-        <w:rPr>
-          <w:rFonts w:asciiTheme="minorHAnsi" w:hAnsiTheme="minorHAnsi" w:cstheme="minorHAnsi"/>
-          <w:sz w:val="22"/>
-          <w:szCs w:val="22"/>
-        </w:rPr>
-        <w:t xml:space="preserve"> provincia_nombre )</w:t>
+        <w:t>cod_provincia</w:t>
+      </w:r>
+      <w:proofErr w:type="spellEnd"/>
+      <w:r>
+        <w:rPr>
+          <w:rFonts w:asciiTheme="minorHAnsi" w:hAnsiTheme="minorHAnsi" w:cstheme="minorHAnsi"/>
+          <w:b/>
+          <w:bCs/>
+          <w:sz w:val="22"/>
+          <w:szCs w:val="22"/>
+          <w:u w:val="single"/>
+        </w:rPr>
+        <w:t>,</w:t>
+      </w:r>
+      <w:r>
+        <w:rPr>
+          <w:rFonts w:asciiTheme="minorHAnsi" w:hAnsiTheme="minorHAnsi" w:cstheme="minorHAnsi"/>
+          <w:sz w:val="22"/>
+          <w:szCs w:val="22"/>
+        </w:rPr>
+        <w:t xml:space="preserve"> </w:t>
+      </w:r>
+      <w:proofErr w:type="spellStart"/>
+      <w:r>
+        <w:rPr>
+          <w:rFonts w:asciiTheme="minorHAnsi" w:hAnsiTheme="minorHAnsi" w:cstheme="minorHAnsi"/>
+          <w:sz w:val="22"/>
+          <w:szCs w:val="22"/>
+        </w:rPr>
+        <w:t>provincia_nombre</w:t>
+      </w:r>
+      <w:proofErr w:type="spellEnd"/>
+      <w:r>
+        <w:rPr>
+          <w:rFonts w:asciiTheme="minorHAnsi" w:hAnsiTheme="minorHAnsi" w:cstheme="minorHAnsi"/>
+          <w:sz w:val="22"/>
+          <w:szCs w:val="22"/>
+        </w:rPr>
+        <w:t xml:space="preserve"> )</w:t>
       </w:r>
     </w:p>
     <w:p>
@@ -14105,6 +15888,7 @@
         </w:rPr>
         <w:t xml:space="preserve"> </w:t>
       </w:r>
+      <w:proofErr w:type="spellStart"/>
       <w:r>
         <w:rPr>
           <w:rFonts w:asciiTheme="minorHAnsi" w:hAnsiTheme="minorHAnsi" w:cstheme="minorHAnsi"/>
@@ -14116,6 +15900,7 @@
         </w:rPr>
         <w:t>cod_provincia</w:t>
       </w:r>
+      <w:proofErr w:type="spellEnd"/>
       <w:r>
         <w:rPr>
           <w:rFonts w:asciiTheme="minorHAnsi" w:hAnsiTheme="minorHAnsi" w:cstheme="minorHAnsi"/>
@@ -14154,6 +15939,7 @@
         </w:rPr>
         <w:t xml:space="preserve">: { </w:t>
       </w:r>
+      <w:proofErr w:type="spellStart"/>
       <w:r>
         <w:rPr>
           <w:rFonts w:asciiTheme="minorHAnsi" w:hAnsiTheme="minorHAnsi" w:cstheme="minorHAnsi"/>
@@ -14165,6 +15951,7 @@
         </w:rPr>
         <w:t>cod_provincia</w:t>
       </w:r>
+      <w:proofErr w:type="spellEnd"/>
       <w:r>
         <w:rPr>
           <w:rFonts w:asciiTheme="minorHAnsi" w:hAnsiTheme="minorHAnsi" w:cstheme="minorHAnsi"/>
@@ -14191,7 +15978,25 @@
           <w:sz w:val="22"/>
           <w:szCs w:val="22"/>
         </w:rPr>
-        <w:t>VNN: { provincia_nombre }</w:t>
+        <w:t xml:space="preserve">VNN: { </w:t>
+      </w:r>
+      <w:proofErr w:type="spellStart"/>
+      <w:r>
+        <w:rPr>
+          <w:rFonts w:asciiTheme="minorHAnsi" w:hAnsiTheme="minorHAnsi" w:cstheme="minorHAnsi"/>
+          <w:sz w:val="22"/>
+          <w:szCs w:val="22"/>
+        </w:rPr>
+        <w:t>provincia_nombre</w:t>
+      </w:r>
+      <w:proofErr w:type="spellEnd"/>
+      <w:r>
+        <w:rPr>
+          <w:rFonts w:asciiTheme="minorHAnsi" w:hAnsiTheme="minorHAnsi" w:cstheme="minorHAnsi"/>
+          <w:sz w:val="22"/>
+          <w:szCs w:val="22"/>
+        </w:rPr>
+        <w:t xml:space="preserve"> }</w:t>
       </w:r>
     </w:p>
     <w:p>
@@ -14211,7 +16016,25 @@
           <w:sz w:val="22"/>
           <w:szCs w:val="22"/>
         </w:rPr>
-        <w:t>UNIQUE: { provincia_nombre }</w:t>
+        <w:t xml:space="preserve">UNIQUE: { </w:t>
+      </w:r>
+      <w:proofErr w:type="spellStart"/>
+      <w:r>
+        <w:rPr>
+          <w:rFonts w:asciiTheme="minorHAnsi" w:hAnsiTheme="minorHAnsi" w:cstheme="minorHAnsi"/>
+          <w:sz w:val="22"/>
+          <w:szCs w:val="22"/>
+        </w:rPr>
+        <w:t>provincia_nombre</w:t>
+      </w:r>
+      <w:proofErr w:type="spellEnd"/>
+      <w:r>
+        <w:rPr>
+          <w:rFonts w:asciiTheme="minorHAnsi" w:hAnsiTheme="minorHAnsi" w:cstheme="minorHAnsi"/>
+          <w:sz w:val="22"/>
+          <w:szCs w:val="22"/>
+        </w:rPr>
+        <w:t xml:space="preserve"> }</w:t>
       </w:r>
     </w:p>
     <w:p>
@@ -14489,73 +16312,6 @@
     <w:p>
       <w:pPr>
         <w:pStyle w:val="Standard"/>
-        <w:numPr>
-          <w:ilvl w:val="0"/>
-          <w:numId w:val="2"/>
-        </w:numPr>
-        <w:spacing w:after="113"/>
-        <w:rPr>
-          <w:rFonts w:asciiTheme="minorHAnsi" w:hAnsiTheme="minorHAnsi" w:cstheme="minorHAnsi"/>
-          <w:sz w:val="22"/>
-          <w:szCs w:val="22"/>
-        </w:rPr>
-      </w:pPr>
-      <w:r>
-        <w:rPr>
-          <w:rFonts w:asciiTheme="minorHAnsi" w:hAnsiTheme="minorHAnsi" w:cstheme="minorHAnsi"/>
-          <w:sz w:val="22"/>
-          <w:szCs w:val="22"/>
-        </w:rPr>
-        <w:t xml:space="preserve">Se modela como entidades los atributos Código Postal, Municipio y Provincia, </w:t>
-      </w:r>
-      <w:r>
-        <w:rPr>
-          <w:rFonts w:asciiTheme="minorHAnsi" w:hAnsiTheme="minorHAnsi" w:cstheme="minorHAnsi"/>
-          <w:sz w:val="22"/>
-          <w:szCs w:val="22"/>
-        </w:rPr>
-        <w:t>incluidos</w:t>
-      </w:r>
-      <w:r>
-        <w:rPr>
-          <w:rFonts w:asciiTheme="minorHAnsi" w:hAnsiTheme="minorHAnsi" w:cstheme="minorHAnsi"/>
-          <w:sz w:val="22"/>
-          <w:szCs w:val="22"/>
-        </w:rPr>
-        <w:t xml:space="preserve"> en las Entidades ALUMNO, CENTRO y EMPRESA</w:t>
-      </w:r>
-      <w:r>
-        <w:rPr>
-          <w:rFonts w:asciiTheme="minorHAnsi" w:hAnsiTheme="minorHAnsi" w:cstheme="minorHAnsi"/>
-          <w:sz w:val="22"/>
-          <w:szCs w:val="22"/>
-        </w:rPr>
-        <w:t>, ya que estos atributos no dependen funcionalmente de la clave primaria de dichas entidades.</w:t>
-      </w:r>
-    </w:p>
-    <w:p>
-      <w:pPr>
-        <w:pStyle w:val="Standard"/>
-        <w:spacing w:after="113"/>
-        <w:ind w:left="720"/>
-        <w:rPr>
-          <w:rFonts w:asciiTheme="minorHAnsi" w:hAnsiTheme="minorHAnsi" w:cstheme="minorHAnsi"/>
-          <w:sz w:val="22"/>
-          <w:szCs w:val="22"/>
-        </w:rPr>
-      </w:pPr>
-      <w:r>
-        <w:rPr>
-          <w:rFonts w:asciiTheme="minorHAnsi" w:hAnsiTheme="minorHAnsi" w:cstheme="minorHAnsi"/>
-          <w:sz w:val="22"/>
-          <w:szCs w:val="22"/>
-        </w:rPr>
-        <w:t>Se parte de la base que un municipio puede albergar uno o más Códigos Postales, y en una provincia no existen dos municipios con nombres idénticos, ni existen dos nombres iguales de provincia, además que la base de datos únicamente va albergar alumnos, empresas y centros dentro del territorio español.</w:t>
-      </w:r>
-    </w:p>
-    <w:p>
-      <w:pPr>
-        <w:pStyle w:val="Standard"/>
         <w:spacing w:after="113"/>
         <w:rPr>
           <w:rFonts w:asciiTheme="minorHAnsi" w:hAnsiTheme="minorHAnsi" w:cstheme="minorHAnsi"/>
@@ -14679,15 +16435,23 @@
           <w:sz w:val="22"/>
           <w:szCs w:val="22"/>
         </w:rPr>
-        <w:t>No se detectan dependencias transitivas</w:t>
-      </w:r>
-      <w:r>
-        <w:rPr>
-          <w:rFonts w:asciiTheme="minorHAnsi" w:hAnsiTheme="minorHAnsi" w:cstheme="minorHAnsi"/>
-          <w:sz w:val="22"/>
-          <w:szCs w:val="22"/>
-        </w:rPr>
-        <w:t>.</w:t>
+        <w:t xml:space="preserve">Para eliminar dependencias transitivas, </w:t>
+      </w:r>
+      <w:r>
+        <w:rPr>
+          <w:rFonts w:asciiTheme="minorHAnsi" w:hAnsiTheme="minorHAnsi" w:cstheme="minorHAnsi"/>
+          <w:sz w:val="22"/>
+          <w:szCs w:val="22"/>
+        </w:rPr>
+        <w:t>Se modela como entidades los atributos Código Postal, Municipio y Provincia, incluidos en las Entidades ALUMNO, CENTRO y EMPRESA</w:t>
+      </w:r>
+      <w:r>
+        <w:rPr>
+          <w:rFonts w:asciiTheme="minorHAnsi" w:hAnsiTheme="minorHAnsi" w:cstheme="minorHAnsi"/>
+          <w:sz w:val="22"/>
+          <w:szCs w:val="22"/>
+        </w:rPr>
+        <w:t>, ya que estos atributos no dependen funcionalmente de la clave primaria de dichas entidades.</w:t>
       </w:r>
     </w:p>
     <w:p>
@@ -14707,7 +16471,109 @@
           <w:sz w:val="22"/>
           <w:szCs w:val="22"/>
         </w:rPr>
-        <w:t>Podría existir una dependencia transitiva con el número de convenio de la empresa, que, si existiera un acuerdo con el centro para hacer la FCT si que tendría información, pero si no existe tal acuerdo no contiene información que relaciones a la empresa con el centro.</w:t>
+        <w:t xml:space="preserve">Se parte de la base que un </w:t>
+      </w:r>
+      <w:r>
+        <w:rPr>
+          <w:rFonts w:asciiTheme="minorHAnsi" w:hAnsiTheme="minorHAnsi" w:cstheme="minorHAnsi"/>
+          <w:sz w:val="22"/>
+          <w:szCs w:val="22"/>
+          <w:u w:val="single"/>
+        </w:rPr>
+        <w:t>municipio</w:t>
+      </w:r>
+      <w:r>
+        <w:rPr>
+          <w:rFonts w:asciiTheme="minorHAnsi" w:hAnsiTheme="minorHAnsi" w:cstheme="minorHAnsi"/>
+          <w:sz w:val="22"/>
+          <w:szCs w:val="22"/>
+        </w:rPr>
+        <w:t xml:space="preserve"> puede albergar uno o más Códigos Postales, y en una provincia no existen dos municipios con nombres idénticos, ni existen dos nombres iguales de provincia, además que la base de datos únicamente va albergar alumnos, empresas y centros dentro del territorio español.</w:t>
+      </w:r>
+    </w:p>
+    <w:p>
+      <w:pPr>
+        <w:pStyle w:val="Standard"/>
+        <w:numPr>
+          <w:ilvl w:val="0"/>
+          <w:numId w:val="2"/>
+        </w:numPr>
+        <w:spacing w:after="113"/>
+        <w:rPr>
+          <w:rFonts w:asciiTheme="minorHAnsi" w:hAnsiTheme="minorHAnsi" w:cstheme="minorHAnsi"/>
+          <w:sz w:val="22"/>
+          <w:szCs w:val="22"/>
+        </w:rPr>
+      </w:pPr>
+      <w:r>
+        <w:rPr>
+          <w:rFonts w:asciiTheme="minorHAnsi" w:hAnsiTheme="minorHAnsi" w:cstheme="minorHAnsi"/>
+          <w:sz w:val="22"/>
+          <w:szCs w:val="22"/>
+        </w:rPr>
+        <w:t xml:space="preserve">No se detectan </w:t>
+      </w:r>
+      <w:r>
+        <w:rPr>
+          <w:rFonts w:asciiTheme="minorHAnsi" w:hAnsiTheme="minorHAnsi" w:cstheme="minorHAnsi"/>
+          <w:sz w:val="22"/>
+          <w:szCs w:val="22"/>
+        </w:rPr>
+        <w:t xml:space="preserve">más </w:t>
+      </w:r>
+      <w:r>
+        <w:rPr>
+          <w:rFonts w:asciiTheme="minorHAnsi" w:hAnsiTheme="minorHAnsi" w:cstheme="minorHAnsi"/>
+          <w:sz w:val="22"/>
+          <w:szCs w:val="22"/>
+        </w:rPr>
+        <w:t>dependencias transitivas</w:t>
+      </w:r>
+      <w:r>
+        <w:rPr>
+          <w:rFonts w:asciiTheme="minorHAnsi" w:hAnsiTheme="minorHAnsi" w:cstheme="minorHAnsi"/>
+          <w:sz w:val="22"/>
+          <w:szCs w:val="22"/>
+        </w:rPr>
+        <w:t>.</w:t>
+      </w:r>
+    </w:p>
+    <w:p>
+      <w:pPr>
+        <w:pStyle w:val="Standard"/>
+        <w:spacing w:after="113"/>
+        <w:ind w:left="720"/>
+        <w:rPr>
+          <w:rFonts w:asciiTheme="minorHAnsi" w:hAnsiTheme="minorHAnsi" w:cstheme="minorHAnsi"/>
+          <w:sz w:val="22"/>
+          <w:szCs w:val="22"/>
+        </w:rPr>
+      </w:pPr>
+      <w:r>
+        <w:rPr>
+          <w:rFonts w:asciiTheme="minorHAnsi" w:hAnsiTheme="minorHAnsi" w:cstheme="minorHAnsi"/>
+          <w:sz w:val="22"/>
+          <w:szCs w:val="22"/>
+        </w:rPr>
+        <w:t xml:space="preserve">Podría existir una dependencia transitiva con el número de convenio de la empresa, que, si existiera un acuerdo con el centro para hacer la FCT </w:t>
+      </w:r>
+      <w:proofErr w:type="spellStart"/>
+      <w:r>
+        <w:rPr>
+          <w:rFonts w:asciiTheme="minorHAnsi" w:hAnsiTheme="minorHAnsi" w:cstheme="minorHAnsi"/>
+          <w:sz w:val="22"/>
+          <w:szCs w:val="22"/>
+        </w:rPr>
+        <w:t>si</w:t>
+      </w:r>
+      <w:proofErr w:type="spellEnd"/>
+      <w:r>
+        <w:rPr>
+          <w:rFonts w:asciiTheme="minorHAnsi" w:hAnsiTheme="minorHAnsi" w:cstheme="minorHAnsi"/>
+          <w:sz w:val="22"/>
+          <w:szCs w:val="22"/>
+        </w:rPr>
+        <w:t xml:space="preserve"> que tendría información, pero si no existe tal acuerdo no contiene información que relaciones a la empresa con el centro.</w:t>
       </w:r>
     </w:p>
     <w:p>

</xml_diff>